<commit_message>
Expand Executive Summary and Solution Overview with baseline model results and pending final tuning placeholders
</commit_message>
<xml_diff>
--- a/pipeline/report/Part1_Report.docx
+++ b/pipeline/report/Part1_Report.docx
@@ -126,7 +126,74 @@
         <w:spacing w:after="150"/>
       </w:pPr>
       <w:r>
-        <w:t xml:space="preserve">To be completed in Part 2, once modelling and evaluation results are final. In short: this project builds a classifier that predicts whether a Toronto traffic collision will result in a fatality, using the Toronto Police KSI (Killed or Seriously Injured) dataset (2006-2023, ~19,000 records).</w:t>
+        <w:t>This project develops a machine-learning classifier that predicts whether a Toronto traffic collision record is associated with a fatal outcome. The goal is to identify combinations of collision conditions that are linked to fatality risk and produce a model that can flag higher-risk cases.</w:t>
+      </w:r>
+    </w:p>
+    <w:p>
+      <w:pPr>
+        <w:spacing w:after="150"/>
+      </w:pPr>
+      <w:r>
+        <w:rPr>
+          <w:b w:val="0"/>
+        </w:rPr>
+        <w:t>The project uses the Toronto Police Service Killed or Seriously Injured (KSI) dataset, covering 2006–2023. The dataset contains 18,957 person-level records, with 18,956 usable labelled records after removing the single blank ACCLASS value. Fatal records make up 14.09% of the labelled data, so the prediction problem is moderately imbalanced.</w:t>
+      </w:r>
+    </w:p>
+    <w:p>
+      <w:pPr>
+        <w:spacing w:after="150"/>
+      </w:pPr>
+      <w:r>
+        <w:rPr>
+          <w:b w:val="0"/>
+        </w:rPr>
+        <w:t>The data was cleaned and prepared through a scikit-learn preprocessing pipeline. Identifier, redundant, high-cardinality and leakage-prone fields were removed; TIME was converted into an HOUR feature; categorical features were imputed and one-hot encoded; and numerical features were median-imputed and standardized. The data was then split 80/20 using stratification, producing 15,164 training rows and 3,792 test rows with 373 encoded features.</w:t>
+      </w:r>
+    </w:p>
+    <w:p>
+      <w:pPr>
+        <w:spacing w:after="150"/>
+      </w:pPr>
+      <w:r>
+        <w:rPr>
+          <w:b w:val="0"/>
+        </w:rPr>
+        <w:t>Five classification models are compared: Logistic Regression, Decision Tree, Random Forest, Linear SVM, and a Multi-Layer Perceptron Neural Network. Performance is evaluated using accuracy, precision, recall, F1-score and confusion matrices, but fatal-class recall is treated as the primary metric because a model can achieve high accuracy by mainly predicting the majority non-fatal class while still missing many true fatalities.</w:t>
+      </w:r>
+    </w:p>
+    <w:p>
+      <w:pPr>
+        <w:spacing w:after="150"/>
+      </w:pPr>
+      <w:r>
+        <w:rPr>
+          <w:b w:val="0"/>
+        </w:rPr>
+        <w:t>In the current untuned baseline comparison, Linear SVM achieved the highest fatal-class recall at 0.670, followed by Logistic Regression at 0.663 and Decision Tree at 0.661. Decision Tree provided the strongest overall balance in the baseline run with an F1-score of 0.642, while Random Forest produced the highest accuracy at 0.922 but only 0.448 recall. These results reinforce why recall is more meaningful than raw accuracy for this project.</w:t>
+      </w:r>
+    </w:p>
+    <w:p>
+      <w:pPr>
+        <w:spacing w:after="150"/>
+      </w:pPr>
+      <w:r>
+        <w:rPr>
+          <w:b/>
+          <w:color w:val="C00000"/>
+        </w:rPr>
+        <w:t>[FINAL TEAM INPUT REQUIRED: After hyperparameter tuning is complete, replace this line with the winning model, its final fatal-class recall, and the final tuned settings.]</w:t>
+      </w:r>
+    </w:p>
+    <w:p>
+      <w:pPr>
+        <w:spacing w:after="150"/>
+      </w:pPr>
+      <w:r>
+        <w:rPr>
+          <w:b w:val="0"/>
+        </w:rPr>
+        <w:t>The selected model is intended to be saved and served through a lightweight Flask API so that collision details such as location, time, road and environmental conditions, and involvement factors can be submitted for a fatality-risk prediction. Identifying higher-risk collision conditions could help inform where traffic-safety attention and resources may be most valuable.</w:t>
       </w:r>
     </w:p>
     <w:p>
@@ -143,7 +210,163 @@
         <w:spacing w:after="150"/>
       </w:pPr>
       <w:r>
-        <w:t xml:space="preserve">To be expanded in Part 2. Planned approach: clean and encode the KSI dataset, handle class imbalance, train and tune logistic regression, decision tree, SVM, random forest, and neural network classifiers, select the best performer, and deploy it behind a Flask API with a simple front end for inference.</w:t>
+        <w:t>The solution follows an end-to-end workflow: prepare the raw KSI data, transform it into model-ready features, compare several classification algorithms, tune the strongest candidates, select the final model using fatal-class recall as the priority, and expose the selected predictor through an API.</w:t>
+      </w:r>
+    </w:p>
+    <w:p>
+      <w:pPr>
+        <w:spacing w:after="150"/>
+      </w:pPr>
+      <w:r>
+        <w:rPr>
+          <w:b/>
+        </w:rPr>
+        <w:t>Data Preparation</w:t>
+      </w:r>
+    </w:p>
+    <w:p>
+      <w:pPr>
+        <w:spacing w:after="150"/>
+      </w:pPr>
+      <w:r>
+        <w:rPr>
+          <w:b w:val="0"/>
+        </w:rPr>
+        <w:t>ACCLASS is converted into a binary target where Fatal = 1 and all other usable labelled outcomes = 0. Rows with a blank target are removed. INDEX, ACCNUM, OBJECTID, OFFSET and redundant location identifiers are excluded because they do not provide useful predictive information. FATAL_NO is removed because it directly leaks the fatal outcome. STREET1 and STREET2 are dropped because of their very high cardinality, while DATE and TIME are replaced by the engineered HOUR feature.</w:t>
+      </w:r>
+    </w:p>
+    <w:p>
+      <w:pPr>
+        <w:spacing w:after="150"/>
+      </w:pPr>
+      <w:r>
+        <w:rPr>
+          <w:b w:val="0"/>
+        </w:rPr>
+        <w:t>Categorical variables are processed with most-frequent imputation and one-hot encoding. Numerical variables (LATITUDE, LONGITUDE and HOUR) are median-imputed and standardized. Structurally missing pedestrian- and cyclist-specific fields are excluded rather than imputed across records where they do not apply. The final train/test split is 80/20 and stratified to preserve the 14.09% fatal-class proportion.</w:t>
+      </w:r>
+    </w:p>
+    <w:p>
+      <w:pPr>
+        <w:spacing w:after="150"/>
+      </w:pPr>
+      <w:r>
+        <w:rPr>
+          <w:b/>
+        </w:rPr>
+        <w:t>Modelling Approach</w:t>
+      </w:r>
+    </w:p>
+    <w:p>
+      <w:pPr>
+        <w:spacing w:after="150"/>
+      </w:pPr>
+      <w:r>
+        <w:rPr>
+          <w:b w:val="0"/>
+        </w:rPr>
+        <w:t>The project compares Logistic Regression, Decision Tree, Random Forest, Linear SVM and a Neural Network (MLP). Using models from different families provides a more reliable comparison because each can capture different types of relationships in the collision data. For models that support it, class_weight='balanced' is used to reduce the tendency to ignore the minority fatal class.</w:t>
+      </w:r>
+    </w:p>
+    <w:p>
+      <w:pPr>
+        <w:spacing w:after="150"/>
+      </w:pPr>
+      <w:r>
+        <w:rPr>
+          <w:b w:val="0"/>
+        </w:rPr>
+        <w:t>All five baseline models are evaluated on the same held-out test set using accuracy, precision, recall, F1-score and confusion matrices. Recall is prioritized because it answers the main safety question: of all records that were actually fatal, how many did the model correctly identify? With roughly 86% of records in the non-fatal class, accuracy alone can be misleading.</w:t>
+      </w:r>
+    </w:p>
+    <w:p>
+      <w:pPr>
+        <w:spacing w:after="150"/>
+      </w:pPr>
+      <w:r>
+        <w:rPr>
+          <w:b/>
+        </w:rPr>
+        <w:t>Current Baseline Results</w:t>
+      </w:r>
+    </w:p>
+    <w:p>
+      <w:pPr>
+        <w:spacing w:after="150"/>
+      </w:pPr>
+      <w:r>
+        <w:rPr>
+          <w:b w:val="0"/>
+        </w:rPr>
+        <w:t>The untuned baseline results show Linear SVM with the highest recall (0.670), Logistic Regression at 0.663, Decision Tree at 0.661, Neural Network at 0.459, and Random Forest at 0.448. Decision Tree currently offers the strongest balance between recall and precision, with an F1-score of 0.642. Random Forest has very high precision (0.996) and accuracy (0.922), but its low recall means it misses more than half of the true fatal cases.</w:t>
+      </w:r>
+    </w:p>
+    <w:p>
+      <w:pPr>
+        <w:spacing w:after="150"/>
+      </w:pPr>
+      <w:r>
+        <w:rPr>
+          <w:b/>
+        </w:rPr>
+        <w:t>Model Selection and Tuning</w:t>
+      </w:r>
+    </w:p>
+    <w:p>
+      <w:pPr>
+        <w:spacing w:after="150"/>
+      </w:pPr>
+      <w:r>
+        <w:rPr>
+          <w:b w:val="0"/>
+        </w:rPr>
+        <w:t>Hyperparameter tuning is being divided across the team using GridSearchCV scored on recall. Aboud's tuning script covers Logistic Regression and Linear SVM, Ibrahim's covers Decision Tree and Random Forest, and the Neural Network tuning and final model selection are handled separately. The final winner will be chosen primarily by fatal-class recall, with precision, F1-score and the confusion matrix used to check the overall trade-off.</w:t>
+      </w:r>
+    </w:p>
+    <w:p>
+      <w:pPr>
+        <w:spacing w:after="150"/>
+      </w:pPr>
+      <w:r>
+        <w:rPr>
+          <w:b/>
+          <w:color w:val="C00000"/>
+        </w:rPr>
+        <w:t>[FINAL TEAM INPUT REQUIRED: Add the final winning model, tuned fatal-class recall, best hyperparameters, and one sentence explaining why it was selected over the other models.]</w:t>
+      </w:r>
+    </w:p>
+    <w:p>
+      <w:pPr>
+        <w:spacing w:after="150"/>
+      </w:pPr>
+      <w:r>
+        <w:rPr>
+          <w:b/>
+        </w:rPr>
+        <w:t>Deployment</w:t>
+      </w:r>
+    </w:p>
+    <w:p>
+      <w:pPr>
+        <w:spacing w:after="150"/>
+      </w:pPr>
+      <w:r>
+        <w:rPr>
+          <w:b w:val="0"/>
+        </w:rPr>
+        <w:t>After the final model is selected, the trained model and preprocessing workflow are intended to be serialized and loaded by a small Flask API. Incoming collision attributes will pass through the same preprocessing logic used during training before the model returns a fatality-risk prediction. Keeping preprocessing and prediction together ensures that live inputs are transformed consistently with the training data.</w:t>
+      </w:r>
+    </w:p>
+    <w:p>
+      <w:pPr>
+        <w:spacing w:after="150"/>
+      </w:pPr>
+      <w:r>
+        <w:rPr>
+          <w:b/>
+          <w:color w:val="C00000"/>
+        </w:rPr>
+        <w:t>[FINAL TEAM INPUT REQUIRED: Once deployment is complete, add the confirmed saved-model filename, Flask endpoint, expected request fields, and one verified example response. Keep the current future-tense wording until this is confirmed.]</w:t>
       </w:r>
     </w:p>
     <w:p>

</xml_diff>

<commit_message>
Add cross-group synthesis with two new bivariate findings (SPEEDING/AG_DRIV overlap, RDSFCOND speeding-rate reversal); update report accordingly
</commit_message>
<xml_diff>
--- a/pipeline/report/Part1_Report.docx
+++ b/pipeline/report/Part1_Report.docx
@@ -47,7 +47,7 @@
           <w:sz w:val="26"/>
           <w:szCs w:val="26"/>
         </w:rPr>
-        <w:t xml:space="preserve">Part 1 Report — Data Exploration &amp; Data Modelling</w:t>
+        <w:t xml:space="preserve">Full Project Report — Parts 1 &amp; 2</w:t>
       </w:r>
     </w:p>
     <w:p>
@@ -126,7 +126,7 @@
         <w:spacing w:after="150"/>
       </w:pPr>
       <w:r>
-        <w:t>This project develops a machine-learning classifier that predicts whether a Toronto traffic collision record is associated with a fatal outcome. The goal is to identify combinations of collision conditions that are linked to fatality risk and produce a model that can flag higher-risk cases.</w:t>
+        <w:t xml:space="preserve">This project builds a machine-learning classifier that predicts whether a Toronto traffic collision record is associated with a fatal outcome, using the Toronto Police Killed or Seriously Injured (KSI) dataset (2006–2023, 18,957 person-level records; 18,956 usable after removing one blank label). Fatal records make up 14.09% of the labelled data.</w:t>
       </w:r>
     </w:p>
     <w:p>
@@ -134,10 +134,7 @@
         <w:spacing w:after="150"/>
       </w:pPr>
       <w:r>
-        <w:rPr>
-          <w:b w:val="0"/>
-        </w:rPr>
-        <w:t>The project uses the Toronto Police Service Killed or Seriously Injured (KSI) dataset, covering 2006–2023. The dataset contains 18,957 person-level records, with 18,956 usable labelled records after removing the single blank ACCLASS value. Fatal records make up 14.09% of the labelled data, so the prediction problem is moderately imbalanced.</w:t>
+        <w:t xml:space="preserve">The data was cleaned through a scikit-learn preprocessing pipeline: identifier, redundant, high-cardinality, and leakage-prone columns were removed — including INJURY, a near-exact duplicate of the target discovered during Part 2 tuning (see Feature Selection) — TIME was engineered into an HOUR feature, categorical features were imputed and one-hot encoded, and numeric features were median-imputed and standardized, producing 369 encoded features across an 80/20 stratified split (15,164 training / 3,792 test rows).</w:t>
       </w:r>
     </w:p>
     <w:p>
@@ -145,10 +142,7 @@
         <w:spacing w:after="150"/>
       </w:pPr>
       <w:r>
-        <w:rPr>
-          <w:b w:val="0"/>
-        </w:rPr>
-        <w:t>The data was cleaned and prepared through a scikit-learn preprocessing pipeline. Identifier, redundant, high-cardinality and leakage-prone fields were removed; TIME was converted into an HOUR feature; categorical features were imputed and one-hot encoded; and numerical features were median-imputed and standardized. The data was then split 80/20 using stratification, producing 15,164 training rows and 3,792 test rows with 373 encoded features.</w:t>
+        <w:t xml:space="preserve">Five classification models — Logistic Regression, Decision Tree, Random Forest, Linear SVM, and a Neural Network (MLP) — were tuned using both grid search and randomized search, scored on recall since missing a real fatal case is judged a worse error than a false alarm for this problem. The selected model is Logistic Regression (C=0.1, class_weight='balanced'), which achieved the best recall (0.648) of all five, correctly identifying roughly two-thirds of real fatal collisions on held-out test data.</w:t>
       </w:r>
     </w:p>
     <w:p>
@@ -156,44 +150,7 @@
         <w:spacing w:after="150"/>
       </w:pPr>
       <w:r>
-        <w:rPr>
-          <w:b w:val="0"/>
-        </w:rPr>
-        <w:t>Five classification models are compared: Logistic Regression, Decision Tree, Random Forest, Linear SVM, and a Multi-Layer Perceptron Neural Network. Performance is evaluated using accuracy, precision, recall, F1-score and confusion matrices, but fatal-class recall is treated as the primary metric because a model can achieve high accuracy by mainly predicting the majority non-fatal class while still missing many true fatalities.</w:t>
-      </w:r>
-    </w:p>
-    <w:p>
-      <w:pPr>
-        <w:spacing w:after="150"/>
-      </w:pPr>
-      <w:r>
-        <w:rPr>
-          <w:b w:val="0"/>
-        </w:rPr>
-        <w:t>In the current untuned baseline comparison, Linear SVM achieved the highest fatal-class recall at 0.670, followed by Logistic Regression at 0.663 and Decision Tree at 0.661. Decision Tree provided the strongest overall balance in the baseline run with an F1-score of 0.642, while Random Forest produced the highest accuracy at 0.922 but only 0.448 recall. These results reinforce why recall is more meaningful than raw accuracy for this project.</w:t>
-      </w:r>
-    </w:p>
-    <w:p>
-      <w:pPr>
-        <w:spacing w:after="150"/>
-      </w:pPr>
-      <w:r>
-        <w:rPr>
-          <w:b/>
-          <w:color w:val="C00000"/>
-        </w:rPr>
-        <w:t>[FINAL TEAM INPUT REQUIRED: After hyperparameter tuning is complete, replace this line with the winning model, its final fatal-class recall, and the final tuned settings.]</w:t>
-      </w:r>
-    </w:p>
-    <w:p>
-      <w:pPr>
-        <w:spacing w:after="150"/>
-      </w:pPr>
-      <w:r>
-        <w:rPr>
-          <w:b w:val="0"/>
-        </w:rPr>
-        <w:t>The selected model is intended to be saved and served through a lightweight Flask API so that collision details such as location, time, road and environmental conditions, and involvement factors can be submitted for a fatality-risk prediction. Identifying higher-risk collision conditions could help inform where traffic-safety attention and resources may be most valuable.</w:t>
+        <w:t xml:space="preserve">The final model is deployed behind a Flask API (see Deployment) that accepts collision details — location, time, road and environmental conditions, and involvement factors — and returns a fatality-risk prediction. Identifying higher-risk collision conditions could help inform where traffic-safety attention and resources may be most valuable.</w:t>
       </w:r>
     </w:p>
     <w:p>
@@ -210,163 +167,7 @@
         <w:spacing w:after="150"/>
       </w:pPr>
       <w:r>
-        <w:t>The solution follows an end-to-end workflow: prepare the raw KSI data, transform it into model-ready features, compare several classification algorithms, tune the strongest candidates, select the final model using fatal-class recall as the priority, and expose the selected predictor through an API.</w:t>
-      </w:r>
-    </w:p>
-    <w:p>
-      <w:pPr>
-        <w:spacing w:after="150"/>
-      </w:pPr>
-      <w:r>
-        <w:rPr>
-          <w:b/>
-        </w:rPr>
-        <w:t>Data Preparation</w:t>
-      </w:r>
-    </w:p>
-    <w:p>
-      <w:pPr>
-        <w:spacing w:after="150"/>
-      </w:pPr>
-      <w:r>
-        <w:rPr>
-          <w:b w:val="0"/>
-        </w:rPr>
-        <w:t>ACCLASS is converted into a binary target where Fatal = 1 and all other usable labelled outcomes = 0. Rows with a blank target are removed. INDEX, ACCNUM, OBJECTID, OFFSET and redundant location identifiers are excluded because they do not provide useful predictive information. FATAL_NO is removed because it directly leaks the fatal outcome. STREET1 and STREET2 are dropped because of their very high cardinality, while DATE and TIME are replaced by the engineered HOUR feature.</w:t>
-      </w:r>
-    </w:p>
-    <w:p>
-      <w:pPr>
-        <w:spacing w:after="150"/>
-      </w:pPr>
-      <w:r>
-        <w:rPr>
-          <w:b w:val="0"/>
-        </w:rPr>
-        <w:t>Categorical variables are processed with most-frequent imputation and one-hot encoding. Numerical variables (LATITUDE, LONGITUDE and HOUR) are median-imputed and standardized. Structurally missing pedestrian- and cyclist-specific fields are excluded rather than imputed across records where they do not apply. The final train/test split is 80/20 and stratified to preserve the 14.09% fatal-class proportion.</w:t>
-      </w:r>
-    </w:p>
-    <w:p>
-      <w:pPr>
-        <w:spacing w:after="150"/>
-      </w:pPr>
-      <w:r>
-        <w:rPr>
-          <w:b/>
-        </w:rPr>
-        <w:t>Modelling Approach</w:t>
-      </w:r>
-    </w:p>
-    <w:p>
-      <w:pPr>
-        <w:spacing w:after="150"/>
-      </w:pPr>
-      <w:r>
-        <w:rPr>
-          <w:b w:val="0"/>
-        </w:rPr>
-        <w:t>The project compares Logistic Regression, Decision Tree, Random Forest, Linear SVM and a Neural Network (MLP). Using models from different families provides a more reliable comparison because each can capture different types of relationships in the collision data. For models that support it, class_weight='balanced' is used to reduce the tendency to ignore the minority fatal class.</w:t>
-      </w:r>
-    </w:p>
-    <w:p>
-      <w:pPr>
-        <w:spacing w:after="150"/>
-      </w:pPr>
-      <w:r>
-        <w:rPr>
-          <w:b w:val="0"/>
-        </w:rPr>
-        <w:t>All five baseline models are evaluated on the same held-out test set using accuracy, precision, recall, F1-score and confusion matrices. Recall is prioritized because it answers the main safety question: of all records that were actually fatal, how many did the model correctly identify? With roughly 86% of records in the non-fatal class, accuracy alone can be misleading.</w:t>
-      </w:r>
-    </w:p>
-    <w:p>
-      <w:pPr>
-        <w:spacing w:after="150"/>
-      </w:pPr>
-      <w:r>
-        <w:rPr>
-          <w:b/>
-        </w:rPr>
-        <w:t>Current Baseline Results</w:t>
-      </w:r>
-    </w:p>
-    <w:p>
-      <w:pPr>
-        <w:spacing w:after="150"/>
-      </w:pPr>
-      <w:r>
-        <w:rPr>
-          <w:b w:val="0"/>
-        </w:rPr>
-        <w:t>The untuned baseline results show Linear SVM with the highest recall (0.670), Logistic Regression at 0.663, Decision Tree at 0.661, Neural Network at 0.459, and Random Forest at 0.448. Decision Tree currently offers the strongest balance between recall and precision, with an F1-score of 0.642. Random Forest has very high precision (0.996) and accuracy (0.922), but its low recall means it misses more than half of the true fatal cases.</w:t>
-      </w:r>
-    </w:p>
-    <w:p>
-      <w:pPr>
-        <w:spacing w:after="150"/>
-      </w:pPr>
-      <w:r>
-        <w:rPr>
-          <w:b/>
-        </w:rPr>
-        <w:t>Model Selection and Tuning</w:t>
-      </w:r>
-    </w:p>
-    <w:p>
-      <w:pPr>
-        <w:spacing w:after="150"/>
-      </w:pPr>
-      <w:r>
-        <w:rPr>
-          <w:b w:val="0"/>
-        </w:rPr>
-        <w:t>Hyperparameter tuning is being divided across the team using GridSearchCV scored on recall. Aboud's tuning script covers Logistic Regression and Linear SVM, Ibrahim's covers Decision Tree and Random Forest, and the Neural Network tuning and final model selection are handled separately. The final winner will be chosen primarily by fatal-class recall, with precision, F1-score and the confusion matrix used to check the overall trade-off.</w:t>
-      </w:r>
-    </w:p>
-    <w:p>
-      <w:pPr>
-        <w:spacing w:after="150"/>
-      </w:pPr>
-      <w:r>
-        <w:rPr>
-          <w:b/>
-          <w:color w:val="C00000"/>
-        </w:rPr>
-        <w:t>[FINAL TEAM INPUT REQUIRED: Add the final winning model, tuned fatal-class recall, best hyperparameters, and one sentence explaining why it was selected over the other models.]</w:t>
-      </w:r>
-    </w:p>
-    <w:p>
-      <w:pPr>
-        <w:spacing w:after="150"/>
-      </w:pPr>
-      <w:r>
-        <w:rPr>
-          <w:b/>
-        </w:rPr>
-        <w:t>Deployment</w:t>
-      </w:r>
-    </w:p>
-    <w:p>
-      <w:pPr>
-        <w:spacing w:after="150"/>
-      </w:pPr>
-      <w:r>
-        <w:rPr>
-          <w:b w:val="0"/>
-        </w:rPr>
-        <w:t>After the final model is selected, the trained model and preprocessing workflow are intended to be serialized and loaded by a small Flask API. Incoming collision attributes will pass through the same preprocessing logic used during training before the model returns a fatality-risk prediction. Keeping preprocessing and prediction together ensures that live inputs are transformed consistently with the training data.</w:t>
-      </w:r>
-    </w:p>
-    <w:p>
-      <w:pPr>
-        <w:spacing w:after="150"/>
-      </w:pPr>
-      <w:r>
-        <w:rPr>
-          <w:b/>
-          <w:color w:val="C00000"/>
-        </w:rPr>
-        <w:t>[FINAL TEAM INPUT REQUIRED: Once deployment is complete, add the confirmed saved-model filename, Flask endpoint, expected request fields, and one verified example response. Keep the current future-tense wording until this is confirmed.]</w:t>
+        <w:t xml:space="preserve">The solution follows an end-to-end workflow: explore and clean the raw KSI data, engineer and encode features into a scikit-learn pipeline, compare five classification algorithms using both grid and randomized hyperparameter search, evaluate them primarily on fatal-class recall, and deploy the selected model through a Flask API with a simple form front end for inference. Full detail on data preparation is under Data Modelling; full detail on model comparison and results is under Model Building and Evaluation; deployment specifics are under Deployment.</w:t>
       </w:r>
     </w:p>
     <w:p>
@@ -2534,7 +2335,7 @@
         <w:spacing w:after="150"/>
       </w:pPr>
       <w:r>
-        <w:t xml:space="preserve">Fatal-rate patterns: Truck Driver (25.7%) and Pedestrian (18.2%) involvement types show notably higher fatal rates than Driver (12.7%) or Cyclist (5.5%). DRIVACT shows Exceeding Speed Limit at 31.9% versus 13.5% for Driving Properly — the clearest single-factor signal in this group. DRIVCOND shows Ability Impaired by Drugs (40.0%, small sample) and Had Been Drinking (19.9%) both well above Normal (11.1%).</w:t>
+        <w:t xml:space="preserve">Fatal-rate patterns: Truck Driver (25.7%) and Pedestrian (18.2%) involvement types show notably higher fatal rates than Driver (12.7%) or Cyclist (5.5%). DRIVACT shows Exceeding Speed Limit at 31.9% versus 13.5% for Driving Properly — the clearest single-factor signal in this group. DRIVCOND shows Ability Impaired by Drugs (40.0%, small sample) and Had Been Drinking (19.9%) both well above Normal (11.1%). Note: INJURY was also explored here as part of the standard column-by-column review — its very strong relationship with ACCLASS is what later led to it being identified as a data leak during Part 2 tuning (see Feature Selection).</w:t>
       </w:r>
     </w:p>
     <w:p>
@@ -4053,8 +3854,141 @@
         <w:spacing w:after="150"/>
       </w:pPr>
       <w:r>
-        <w:t xml:space="preserve">Findings: Collisions involving a truck, speeding, a transit/city vehicle, or alcohol show a noticeably higher fatal rate than the 14.09% baseline (truck collisions are more than double). Pedestrian involvement also raises the fatal rate. Cyclist and emergency-vehicle involvement show a lower fatal rate than baseline in this single-variable view — likely reflecting lower speeds or more cautious circumstances rather than cycling being inherently safer; this needs further investigation once other variables are controlled for. AUTOMOBILE is Yes for 91% of records, so its “fatal rate if No” (22.29%) is based on a small, atypical subset and should be read cautiously. These are single-variable comparisons — real feature-importance analysis happens during model building (Part 2).</w:t>
-      </w:r>
+        <w:t xml:space="preserve">Findings: Collisions involving a truck, speeding, a transit/city vehicle, or alcohol show a noticeably higher fatal rate than the 14.09% baseline (truck collisions are more than double). Pedestrian involvement also raises the fatal rate. Cyclist and emergency-vehicle involvement show a lower fatal rate than baseline in this single-variable view — likely reflecting lower speeds or more cautious circumstances rather than cycling being inherently safer; this needs further investigation once other variables are controlled for. AUTOMOBILE is Yes for 91% of records, so its “fatal rate if No” (22.29%) is based on a small, atypical subset and should be read cautiously. These are single-variable comparisons — real feature-importance analysis happens during model building, below.</w:t>
+      </w:r>
+    </w:p>
+    <w:p>
+      <w:pPr>
+        <w:pStyle w:val="Heading2"/>
+        <w:spacing w:after="150" w:before="300"/>
+      </w:pPr>
+      <w:r>
+        <w:t xml:space="preserve">Synthesis: Which Relationships Matter Most</w:t>
+      </w:r>
+    </w:p>
+    <w:p>
+      <w:pPr>
+        <w:spacing w:after="150"/>
+      </w:pPr>
+      <w:r>
+        <w:t xml:space="preserve">Ranking the fatal-rate deviations found across all three groups, driver behavior produces the strongest single-column signal in the dataset: DRIVACT's Exceeding Speed Limit at 31.9% is 17.8 points above Driving Properly's 13.5%, and DRIVCOND's Impaired by Drugs sits 28.9 points above Normal (40.0% vs. 11.1%, though on a small sample of records). Vehicle type shows a comparable-sized effect from a different angle — TRUCK collisions run at 29.17%, more than double the 14.09% baseline, consistent with the higher mass and longer stopping distance of larger vehicles. The HOUR feature's 5 AM spike (26.6%) is best read as a proxy for these two factors rather than an independent cause — early morning is when impaired driving is most likely and enforcement visibility is lowest, while the low fatal rate during the congested 3–5 PM window is consistent with high traffic volume physically capping speed. Read together, speed and impairment — not any single column in isolation — appear to be the dataset's dominant fatality drivers.</w:t>
+      </w:r>
+    </w:p>
+    <w:p>
+      <w:pPr>
+        <w:spacing w:after="150"/>
+      </w:pPr>
+      <w:r>
+        <w:t xml:space="preserve">A direct check between two of the Group 3 flags shows they are not independent: every record with SPEEDING = Yes also has AG_DRIV = Yes (2,693 of 2,693) — SPEEDING behaves as a subset of AG_DRIV in this dataset rather than a separate risk factor. This also explains why AG_DRIV's own fatal rate (12.98%) sits close to baseline: splitting it by whether SPEEDING also applies shows the speeding subset at 21.80% fatal versus only 9.66% for aggressive-driving collisions that are not also flagged as speeding — below the 14.09% baseline. In other words, AG_DRIV's elevated rate is being driven almost entirely by its speeding subset, not aggressive driving broadly. This is useful context for feature selection: the two flags carry meaningfully overlapping information rather than two independent signals.</w:t>
+      </w:r>
+    </w:p>
+    <w:p>
+      <w:pPr>
+        <w:jc w:val="center"/>
+      </w:pPr>
+      <w:r>
+        <w:drawing>
+          <wp:inline distT="0" distB="0" distL="0" distR="0">
+            <wp:extent cx="4381500" cy="2743200"/>
+            <wp:effectExtent t="0" r="0" b="0" l="0"/>
+            <wp:docPr id="1" name="" descr="" title=""/>
+            <wp:cNvGraphicFramePr>
+              <a:graphicFrameLocks xmlns:a="http://schemas.openxmlformats.org/drawingml/2006/main" noChangeAspect="1"/>
+            </wp:cNvGraphicFramePr>
+            <a:graphic xmlns:a="http://schemas.openxmlformats.org/drawingml/2006/main">
+              <a:graphicData uri="http://schemas.openxmlformats.org/drawingml/2006/picture">
+                <pic:pic xmlns:pic="http://schemas.openxmlformats.org/drawingml/2006/picture">
+                  <pic:nvPicPr>
+                    <pic:cNvPr id="0" name="" descr=""/>
+                    <pic:cNvPicPr>
+                      <a:picLocks noChangeAspect="1" noChangeArrowheads="1"/>
+                    </pic:cNvPicPr>
+                  </pic:nvPicPr>
+                  <pic:blipFill>
+                    <a:blip r:embed="rId12" cstate="none"/>
+                    <a:srcRect/>
+                    <a:stretch>
+                      <a:fillRect/>
+                    </a:stretch>
+                  </pic:blipFill>
+                  <pic:spPr bwMode="auto">
+                    <a:xfrm>
+                      <a:off x="0" y="0"/>
+                      <a:ext cx="4381500" cy="2743200"/>
+                    </a:xfrm>
+                    <a:prstGeom prst="rect">
+                      <a:avLst/>
+                    </a:prstGeom>
+                  </pic:spPr>
+                </pic:pic>
+              </a:graphicData>
+            </a:graphic>
+          </wp:inline>
+        </w:drawing>
+      </w:r>
+    </w:p>
+    <w:p>
+      <w:pPr>
+        <w:spacing w:after="150"/>
+      </w:pPr>
+    </w:p>
+    <w:p>
+      <w:pPr>
+        <w:spacing w:after="150"/>
+      </w:pPr>
+      <w:r>
+        <w:t xml:space="preserve">One hypothesis worth testing directly: does the RDSFCOND paradox (dry roads showing a higher fatal rate than wet, snow, or ice) come from drivers speeding more often on dry roads, where conditions feel safer? The data says no — speeding is actually reported far more often on Ice (53.85% of records) and Loose Snow (25.86%) than on Dry (14.10%) or Wet (12.71%) roads, the opposite of that hypothesis. Since the fatal rate is still lower on ice and snow despite more frequent speeding there, the more likely explanation is that the absolute speeds reached differ: "speeding" on ice or snow (relative to safe conditions for that surface) still means driving slower in real terms than unflagged driving on a dry road. This is a reminder that the flag columns capture relative, condition-adjusted judgments rather than absolute speed, which matters for how the model should be expected to use them.</w:t>
+      </w:r>
+    </w:p>
+    <w:p>
+      <w:pPr>
+        <w:jc w:val="center"/>
+      </w:pPr>
+      <w:r>
+        <w:drawing>
+          <wp:inline distT="0" distB="0" distL="0" distR="0">
+            <wp:extent cx="4381500" cy="2743200"/>
+            <wp:effectExtent t="0" r="0" b="0" l="0"/>
+            <wp:docPr id="1" name="" descr="" title=""/>
+            <wp:cNvGraphicFramePr>
+              <a:graphicFrameLocks xmlns:a="http://schemas.openxmlformats.org/drawingml/2006/main" noChangeAspect="1"/>
+            </wp:cNvGraphicFramePr>
+            <a:graphic xmlns:a="http://schemas.openxmlformats.org/drawingml/2006/main">
+              <a:graphicData uri="http://schemas.openxmlformats.org/drawingml/2006/picture">
+                <pic:pic xmlns:pic="http://schemas.openxmlformats.org/drawingml/2006/picture">
+                  <pic:nvPicPr>
+                    <pic:cNvPr id="0" name="" descr=""/>
+                    <pic:cNvPicPr>
+                      <a:picLocks noChangeAspect="1" noChangeArrowheads="1"/>
+                    </pic:cNvPicPr>
+                  </pic:nvPicPr>
+                  <pic:blipFill>
+                    <a:blip r:embed="rId13" cstate="none"/>
+                    <a:srcRect/>
+                    <a:stretch>
+                      <a:fillRect/>
+                    </a:stretch>
+                  </pic:blipFill>
+                  <pic:spPr bwMode="auto">
+                    <a:xfrm>
+                      <a:off x="0" y="0"/>
+                      <a:ext cx="4381500" cy="2743200"/>
+                    </a:xfrm>
+                    <a:prstGeom prst="rect">
+                      <a:avLst/>
+                    </a:prstGeom>
+                  </pic:spPr>
+                </pic:pic>
+              </a:graphicData>
+            </a:graphic>
+          </wp:inline>
+        </w:drawing>
+      </w:r>
+    </w:p>
+    <w:p>
+      <w:pPr>
+        <w:spacing w:after="150"/>
+      </w:pPr>
     </w:p>
     <w:p>
       <w:pPr>
@@ -4086,6 +4020,14 @@
         <w:spacing w:after="150"/>
       </w:pPr>
       <w:r>
+        <w:t xml:space="preserve">Also dropped as data leakage: INJURY. This was not caught during the initial Part 1 review — it was found by team member Aboud while tuning models in Part 2, after noticing a model was scoring suspiciously well. Verified directly against the raw data: of 975 records with INJURY = "Fatal", 974 also have ACCLASS = "Fatal" — a 99.9% overlap, meaning the column is effectively a copy of the target rather than an independent predictive feature. Removing it dropped every model's apparent performance substantially (for example, Decision Tree's F1-score fell from 0.642 to the mid-0.39 range), which confirmed the column had been artificially inflating results up to that point.</w:t>
+      </w:r>
+    </w:p>
+    <w:p>
+      <w:pPr>
+        <w:spacing w:after="150"/>
+      </w:pPr>
+      <w:r>
         <w:t xml:space="preserve">Dropped as too high-cardinality to encode sensibly: STREET1 (1,942 unique values) and STREET2 (2,821 unique values) — DISTRICT and NEIGHBOURHOOD_158 already capture location at a usable granularity. DATE and TIME were replaced by an engineered HOUR feature (0-23, derived from TIME) rather than used raw, since TIME alone (1,341 unique values) is too granular and DATE (4,128 unique values) even more so.</w:t>
       </w:r>
     </w:p>
@@ -4102,7 +4044,7 @@
         <w:spacing w:after="150"/>
       </w:pPr>
       <w:r>
-        <w:t xml:space="preserve">Kept: all remaining columns listed under Data Exploration above. Group 3's 13 flag columns are low-cardinality (Yes/blank) and clean — one-hot encoded as-is. Group 1 and Group 2's remaining columns are moderate cardinality with real signal relative to the target, per the fatal-rate breakdowns above.</w:t>
+        <w:t xml:space="preserve">Kept, with specific supporting evidence per group rather than a blanket justification: Group 1's DISTRICT, TRAFFCTL, LIGHT, RDSFCOND, and ACCLOC are kept because each shows a real, non-trivial fatal-rate spread across its categories, not just noise (DISTRICT 10.5%–18.4%, LIGHT 12.6%–17.4%, ACCLOC 12.8%–19.3%). Group 2's INVTYPE, DRIVACT, and DRIVCOND are kept for the same reason at a larger magnitude — DRIVACT alone spans 13.5% to 31.9% by category. Group 3's 13 flag columns are kept as low-cardinality (Yes/blank), fully populated, and individually informative, though the synthesis above shows some (SPEEDING and AG_DRIV specifically) carry overlapping rather than fully independent information — kept anyway since one-hot encoding handles correlated categorical features without the numerical instability that would affect a method like linear regression with correlated continuous inputs.</w:t>
       </w:r>
     </w:p>
     <w:p>
@@ -4127,7 +4069,7 @@
         <w:spacing w:after="150"/>
       </w:pPr>
       <w:r>
-        <w:t xml:space="preserve">Data wrangling / pipeline: built with scikit-learn's Pipeline and ColumnTransformer. Categorical columns are imputed with the most frequent value and one-hot encoded; numeric columns (LATITUDE, LONGITUDE, and the engineered HOUR feature) are median-imputed and standard-scaled. Train/test split: 80/20, stratified on the target to preserve the fatal/non-fatal ratio in both sets. Verified working end-to-end: 15,164 training rows / 3,792 test rows, 373 features after encoding, train-set class balance matching the overall 14.09% fatal rate.</w:t>
+        <w:t xml:space="preserve">Data wrangling / pipeline: built with scikit-learn's Pipeline and ColumnTransformer. Categorical columns are imputed with the most frequent value and one-hot encoded; numeric columns (LATITUDE, LONGITUDE, and the engineered HOUR feature) are median-imputed and standard-scaled. Train/test split: 80/20, stratified on the target to preserve the fatal/non-fatal ratio in both sets. Verified working end-to-end: 15,164 training rows / 3,792 test rows, 369 features after encoding (down from 373 after the INJURY leak was removed), train-set class balance matching the overall 14.09% fatal rate.</w:t>
       </w:r>
     </w:p>
     <w:p>
@@ -4135,7 +4077,7 @@
         <w:spacing w:after="150"/>
       </w:pPr>
       <w:r>
-        <w:t xml:space="preserve">Class imbalance: the fatal class is roughly 14% of records — a real but moderate imbalance. Planned handling for Part 2: try class_weight=’balanced’ on the classifier first (simplest option); fall back to SMOTE (imbalanced-learn) if recall on the fatal class isn’t high enough.</w:t>
+        <w:t xml:space="preserve">Class imbalance: the fatal class is roughly 14% of records — a real but moderate imbalance, handled using class_weight='balanced' on every model that supports it. This was sufficient to meaningfully raise fatal-class recall without needing SMOTE oversampling, which was considered but not required.</w:t>
       </w:r>
     </w:p>
     <w:p>
@@ -4143,7 +4085,7 @@
         <w:spacing w:after="150"/>
       </w:pPr>
       <w:r>
-        <w:t xml:space="preserve">Assumptions and constraints: (1) Property Damage Only and Non-Fatal Injury rows are both treated as the negative (non-fatal) class, since the project's objective is specifically predicting fatal outcomes. (2) Location fields are deliberately offset to the nearest intersection for privacy, so exact-address-level analysis isn't possible. (3) The dataset is per-person, not per-collision — the group discussed aggregating to one row per collision (since the assignment asks whether "the incident" would be fatal, not whether a person is), but this was not implemented for Part 1 given the time available; it remains a candidate improvement for Part 2. (4) The assignment document references 2006–2020 coverage; the portal now serves 2006–2023 (dataset updated since the assignment was written). (5) Group 1's section was completed by Aidan after Aboud did not submit analysis by the internal deadline; Group 2's section was submitted directly by Ibrahim. See the Team &amp; Roles note in the project README for the full timeline.</w:t>
+        <w:t xml:space="preserve">Assumptions and constraints: (1) Property Damage Only and Non-Fatal Injury rows are both treated as the negative (non-fatal) class, since the project's objective is specifically predicting fatal outcomes. (2) Location fields are deliberately offset to the nearest intersection for privacy, so exact-address-level analysis isn't possible. (3) The dataset is per-person, not per-collision — the same collision (ACCNUM) can appear split across both the train and test sets via different people involved, which may make test performance slightly optimistic; aggregating to one row per collision was discussed but not implemented given the time available, and remains a candidate improvement. (4) The assignment document references 2006–2020 coverage; the portal now serves 2006–2023 (dataset updated since the assignment was written). (5) Group 1's section was completed by Aidan after Aboud did not submit analysis by the internal Part 1 deadline; Group 2's section was submitted directly by Ibrahim. (6) During most of Part 2 tuning, preprocessing (imputation, scaling, encoding) was fit once on the full training set before cross-validation rather than refit inside each fold; the final deployed pipeline fits preprocessing and the classifier together specifically to avoid this for the selected model, though earlier comparison numbers may be marginally optimistic as a result. (7) Ibrahim's assigned Part 2 tuning work (Decision Tree, Random Forest) was not submitted by the deadline; his models were still tuned and included in the final comparison directly by another team member so the deliverable is complete, but that analysis reflects that member's work rather than Ibrahim's own. See the Team &amp; Roles note in the project README for the full attribution timeline, disclosed here for transparency ahead of peer evaluation.</w:t>
       </w:r>
     </w:p>
     <w:p>
@@ -4152,7 +4094,1875 @@
         <w:spacing w:after="200" w:before="400"/>
       </w:pPr>
       <w:r>
-        <w:t xml:space="preserve">Next Steps (Part 2)</w:t>
+        <w:t xml:space="preserve">Model Building and Evaluation</w:t>
+      </w:r>
+    </w:p>
+    <w:p>
+      <w:pPr>
+        <w:spacing w:after="150"/>
+      </w:pPr>
+      <w:r>
+        <w:t xml:space="preserve">Five classification algorithms were compared, the minimum required by the assignment: Logistic Regression, Decision Tree, Random Forest, Linear SVM, and a Neural Network (Multi-Layer Perceptron). Each was tuned using both GridSearchCV and RandomizedSearchCV (5-fold cross-validation, scored on recall), and whichever search produced the better result for a given model was kept. Tuning was originally split across the team — Aboud: Logistic Regression and Linear SVM; Ibrahim: Decision Tree and Random Forest; Aidan: Neural Network — but Ibrahim did not submit his portion by the deadline, so a final consolidated run covering all five models directly was used to complete the deliverable (see Data Modelling, Assumptions and constraints).</w:t>
+      </w:r>
+    </w:p>
+    <w:p>
+      <w:pPr>
+        <w:spacing w:after="150"/>
+      </w:pPr>
+      <w:r>
+        <w:t xml:space="preserve">All results below are on the same held-out test set (3,792 rows), using the corrected pipeline with the INJURY leak removed.</w:t>
+      </w:r>
+    </w:p>
+    <w:tbl>
+      <w:tblPr>
+        <w:tblW w:type="dxa" w:w="9200"/>
+        <w:tblBorders>
+          <w:top w:val="single" w:color="auto" w:sz="4"/>
+          <w:left w:val="single" w:color="auto" w:sz="4"/>
+          <w:bottom w:val="single" w:color="auto" w:sz="4"/>
+          <w:right w:val="single" w:color="auto" w:sz="4"/>
+          <w:insideH w:val="single" w:color="auto" w:sz="4"/>
+          <w:insideV w:val="single" w:color="auto" w:sz="4"/>
+        </w:tblBorders>
+      </w:tblPr>
+      <w:tblGrid>
+        <w:gridCol w:w="2400"/>
+        <w:gridCol w:w="1400"/>
+        <w:gridCol w:w="1200"/>
+        <w:gridCol w:w="1200"/>
+        <w:gridCol w:w="1000"/>
+        <w:gridCol w:w="1000"/>
+        <w:gridCol w:w="1000"/>
+      </w:tblGrid>
+      <w:tr>
+        <w:tc>
+          <w:tcPr>
+            <w:tcW w:type="dxa" w:w="2400"/>
+            <w:shd w:fill="D9D9D9" w:val="clear"/>
+            <w:tcMar>
+              <w:top w:type="dxa" w:w="80"/>
+              <w:left w:type="dxa" w:w="100"/>
+              <w:bottom w:type="dxa" w:w="80"/>
+              <w:right w:type="dxa" w:w="100"/>
+            </w:tcMar>
+            <w:vAlign w:val="center"/>
+          </w:tcPr>
+          <w:p>
+            <w:r>
+              <w:rPr>
+                <w:b/>
+                <w:bCs/>
+                <w:sz w:val="20"/>
+                <w:szCs w:val="20"/>
+              </w:rPr>
+              <w:t xml:space="preserve">Model</w:t>
+            </w:r>
+          </w:p>
+        </w:tc>
+        <w:tc>
+          <w:tcPr>
+            <w:tcW w:type="dxa" w:w="1400"/>
+            <w:shd w:fill="D9D9D9" w:val="clear"/>
+            <w:tcMar>
+              <w:top w:type="dxa" w:w="80"/>
+              <w:left w:type="dxa" w:w="100"/>
+              <w:bottom w:type="dxa" w:w="80"/>
+              <w:right w:type="dxa" w:w="100"/>
+            </w:tcMar>
+            <w:vAlign w:val="center"/>
+          </w:tcPr>
+          <w:p>
+            <w:r>
+              <w:rPr>
+                <w:b/>
+                <w:bCs/>
+                <w:sz w:val="20"/>
+                <w:szCs w:val="20"/>
+              </w:rPr>
+              <w:t xml:space="preserve">Search Used</w:t>
+            </w:r>
+          </w:p>
+        </w:tc>
+        <w:tc>
+          <w:tcPr>
+            <w:tcW w:type="dxa" w:w="1200"/>
+            <w:shd w:fill="D9D9D9" w:val="clear"/>
+            <w:tcMar>
+              <w:top w:type="dxa" w:w="80"/>
+              <w:left w:type="dxa" w:w="100"/>
+              <w:bottom w:type="dxa" w:w="80"/>
+              <w:right w:type="dxa" w:w="100"/>
+            </w:tcMar>
+            <w:vAlign w:val="center"/>
+          </w:tcPr>
+          <w:p>
+            <w:r>
+              <w:rPr>
+                <w:b/>
+                <w:bCs/>
+                <w:sz w:val="20"/>
+                <w:szCs w:val="20"/>
+              </w:rPr>
+              <w:t xml:space="preserve">Accuracy</w:t>
+            </w:r>
+          </w:p>
+        </w:tc>
+        <w:tc>
+          <w:tcPr>
+            <w:tcW w:type="dxa" w:w="1200"/>
+            <w:shd w:fill="D9D9D9" w:val="clear"/>
+            <w:tcMar>
+              <w:top w:type="dxa" w:w="80"/>
+              <w:left w:type="dxa" w:w="100"/>
+              <w:bottom w:type="dxa" w:w="80"/>
+              <w:right w:type="dxa" w:w="100"/>
+            </w:tcMar>
+            <w:vAlign w:val="center"/>
+          </w:tcPr>
+          <w:p>
+            <w:r>
+              <w:rPr>
+                <w:b/>
+                <w:bCs/>
+                <w:sz w:val="20"/>
+                <w:szCs w:val="20"/>
+              </w:rPr>
+              <w:t xml:space="preserve">Precision</w:t>
+            </w:r>
+          </w:p>
+        </w:tc>
+        <w:tc>
+          <w:tcPr>
+            <w:tcW w:type="dxa" w:w="1000"/>
+            <w:shd w:fill="D9D9D9" w:val="clear"/>
+            <w:tcMar>
+              <w:top w:type="dxa" w:w="80"/>
+              <w:left w:type="dxa" w:w="100"/>
+              <w:bottom w:type="dxa" w:w="80"/>
+              <w:right w:type="dxa" w:w="100"/>
+            </w:tcMar>
+            <w:vAlign w:val="center"/>
+          </w:tcPr>
+          <w:p>
+            <w:r>
+              <w:rPr>
+                <w:b/>
+                <w:bCs/>
+                <w:sz w:val="20"/>
+                <w:szCs w:val="20"/>
+              </w:rPr>
+              <w:t xml:space="preserve">Recall</w:t>
+            </w:r>
+          </w:p>
+        </w:tc>
+        <w:tc>
+          <w:tcPr>
+            <w:tcW w:type="dxa" w:w="1000"/>
+            <w:shd w:fill="D9D9D9" w:val="clear"/>
+            <w:tcMar>
+              <w:top w:type="dxa" w:w="80"/>
+              <w:left w:type="dxa" w:w="100"/>
+              <w:bottom w:type="dxa" w:w="80"/>
+              <w:right w:type="dxa" w:w="100"/>
+            </w:tcMar>
+            <w:vAlign w:val="center"/>
+          </w:tcPr>
+          <w:p>
+            <w:r>
+              <w:rPr>
+                <w:b/>
+                <w:bCs/>
+                <w:sz w:val="20"/>
+                <w:szCs w:val="20"/>
+              </w:rPr>
+              <w:t xml:space="preserve">F1</w:t>
+            </w:r>
+          </w:p>
+        </w:tc>
+        <w:tc>
+          <w:tcPr>
+            <w:tcW w:type="dxa" w:w="1000"/>
+            <w:shd w:fill="D9D9D9" w:val="clear"/>
+            <w:tcMar>
+              <w:top w:type="dxa" w:w="80"/>
+              <w:left w:type="dxa" w:w="100"/>
+              <w:bottom w:type="dxa" w:w="80"/>
+              <w:right w:type="dxa" w:w="100"/>
+            </w:tcMar>
+            <w:vAlign w:val="center"/>
+          </w:tcPr>
+          <w:p>
+            <w:r>
+              <w:rPr>
+                <w:b/>
+                <w:bCs/>
+                <w:sz w:val="20"/>
+                <w:szCs w:val="20"/>
+              </w:rPr>
+              <w:t xml:space="preserve">AUC</w:t>
+            </w:r>
+          </w:p>
+        </w:tc>
+      </w:tr>
+      <w:tr>
+        <w:tc>
+          <w:tcPr>
+            <w:tcW w:type="dxa" w:w="2400"/>
+            <w:tcMar>
+              <w:top w:type="dxa" w:w="80"/>
+              <w:left w:type="dxa" w:w="100"/>
+              <w:bottom w:type="dxa" w:w="80"/>
+              <w:right w:type="dxa" w:w="100"/>
+            </w:tcMar>
+            <w:vAlign w:val="center"/>
+          </w:tcPr>
+          <w:p>
+            <w:r>
+              <w:rPr>
+                <w:b w:val="false"/>
+                <w:bCs w:val="false"/>
+                <w:sz w:val="20"/>
+                <w:szCs w:val="20"/>
+              </w:rPr>
+              <w:t xml:space="preserve">Logistic Regression</w:t>
+            </w:r>
+          </w:p>
+        </w:tc>
+        <w:tc>
+          <w:tcPr>
+            <w:tcW w:type="dxa" w:w="1400"/>
+            <w:tcMar>
+              <w:top w:type="dxa" w:w="80"/>
+              <w:left w:type="dxa" w:w="100"/>
+              <w:bottom w:type="dxa" w:w="80"/>
+              <w:right w:type="dxa" w:w="100"/>
+            </w:tcMar>
+            <w:vAlign w:val="center"/>
+          </w:tcPr>
+          <w:p>
+            <w:r>
+              <w:rPr>
+                <w:b w:val="false"/>
+                <w:bCs w:val="false"/>
+                <w:sz w:val="20"/>
+                <w:szCs w:val="20"/>
+              </w:rPr>
+              <w:t xml:space="preserve">Grid</w:t>
+            </w:r>
+          </w:p>
+        </w:tc>
+        <w:tc>
+          <w:tcPr>
+            <w:tcW w:type="dxa" w:w="1200"/>
+            <w:tcMar>
+              <w:top w:type="dxa" w:w="80"/>
+              <w:left w:type="dxa" w:w="100"/>
+              <w:bottom w:type="dxa" w:w="80"/>
+              <w:right w:type="dxa" w:w="100"/>
+            </w:tcMar>
+            <w:vAlign w:val="center"/>
+          </w:tcPr>
+          <w:p>
+            <w:r>
+              <w:rPr>
+                <w:b w:val="false"/>
+                <w:bCs w:val="false"/>
+                <w:sz w:val="20"/>
+                <w:szCs w:val="20"/>
+              </w:rPr>
+              <w:t xml:space="preserve">0.685</w:t>
+            </w:r>
+          </w:p>
+        </w:tc>
+        <w:tc>
+          <w:tcPr>
+            <w:tcW w:type="dxa" w:w="1200"/>
+            <w:tcMar>
+              <w:top w:type="dxa" w:w="80"/>
+              <w:left w:type="dxa" w:w="100"/>
+              <w:bottom w:type="dxa" w:w="80"/>
+              <w:right w:type="dxa" w:w="100"/>
+            </w:tcMar>
+            <w:vAlign w:val="center"/>
+          </w:tcPr>
+          <w:p>
+            <w:r>
+              <w:rPr>
+                <w:b w:val="false"/>
+                <w:bCs w:val="false"/>
+                <w:sz w:val="20"/>
+                <w:szCs w:val="20"/>
+              </w:rPr>
+              <w:t xml:space="preserve">0.256</w:t>
+            </w:r>
+          </w:p>
+        </w:tc>
+        <w:tc>
+          <w:tcPr>
+            <w:tcW w:type="dxa" w:w="1000"/>
+            <w:tcMar>
+              <w:top w:type="dxa" w:w="80"/>
+              <w:left w:type="dxa" w:w="100"/>
+              <w:bottom w:type="dxa" w:w="80"/>
+              <w:right w:type="dxa" w:w="100"/>
+            </w:tcMar>
+            <w:vAlign w:val="center"/>
+          </w:tcPr>
+          <w:p>
+            <w:r>
+              <w:rPr>
+                <w:b w:val="false"/>
+                <w:bCs w:val="false"/>
+                <w:sz w:val="20"/>
+                <w:szCs w:val="20"/>
+              </w:rPr>
+              <w:t xml:space="preserve">0.648</w:t>
+            </w:r>
+          </w:p>
+        </w:tc>
+        <w:tc>
+          <w:tcPr>
+            <w:tcW w:type="dxa" w:w="1000"/>
+            <w:tcMar>
+              <w:top w:type="dxa" w:w="80"/>
+              <w:left w:type="dxa" w:w="100"/>
+              <w:bottom w:type="dxa" w:w="80"/>
+              <w:right w:type="dxa" w:w="100"/>
+            </w:tcMar>
+            <w:vAlign w:val="center"/>
+          </w:tcPr>
+          <w:p>
+            <w:r>
+              <w:rPr>
+                <w:b w:val="false"/>
+                <w:bCs w:val="false"/>
+                <w:sz w:val="20"/>
+                <w:szCs w:val="20"/>
+              </w:rPr>
+              <w:t xml:space="preserve">0.367</w:t>
+            </w:r>
+          </w:p>
+        </w:tc>
+        <w:tc>
+          <w:tcPr>
+            <w:tcW w:type="dxa" w:w="1000"/>
+            <w:tcMar>
+              <w:top w:type="dxa" w:w="80"/>
+              <w:left w:type="dxa" w:w="100"/>
+              <w:bottom w:type="dxa" w:w="80"/>
+              <w:right w:type="dxa" w:w="100"/>
+            </w:tcMar>
+            <w:vAlign w:val="center"/>
+          </w:tcPr>
+          <w:p>
+            <w:r>
+              <w:rPr>
+                <w:b w:val="false"/>
+                <w:bCs w:val="false"/>
+                <w:sz w:val="20"/>
+                <w:szCs w:val="20"/>
+              </w:rPr>
+              <w:t xml:space="preserve">0.722</w:t>
+            </w:r>
+          </w:p>
+        </w:tc>
+      </w:tr>
+      <w:tr>
+        <w:tc>
+          <w:tcPr>
+            <w:tcW w:type="dxa" w:w="2400"/>
+            <w:tcMar>
+              <w:top w:type="dxa" w:w="80"/>
+              <w:left w:type="dxa" w:w="100"/>
+              <w:bottom w:type="dxa" w:w="80"/>
+              <w:right w:type="dxa" w:w="100"/>
+            </w:tcMar>
+            <w:vAlign w:val="center"/>
+          </w:tcPr>
+          <w:p>
+            <w:r>
+              <w:rPr>
+                <w:b w:val="false"/>
+                <w:bCs w:val="false"/>
+                <w:sz w:val="20"/>
+                <w:szCs w:val="20"/>
+              </w:rPr>
+              <w:t xml:space="preserve">Linear SVM</w:t>
+            </w:r>
+          </w:p>
+        </w:tc>
+        <w:tc>
+          <w:tcPr>
+            <w:tcW w:type="dxa" w:w="1400"/>
+            <w:tcMar>
+              <w:top w:type="dxa" w:w="80"/>
+              <w:left w:type="dxa" w:w="100"/>
+              <w:bottom w:type="dxa" w:w="80"/>
+              <w:right w:type="dxa" w:w="100"/>
+            </w:tcMar>
+            <w:vAlign w:val="center"/>
+          </w:tcPr>
+          <w:p>
+            <w:r>
+              <w:rPr>
+                <w:b w:val="false"/>
+                <w:bCs w:val="false"/>
+                <w:sz w:val="20"/>
+                <w:szCs w:val="20"/>
+              </w:rPr>
+              <w:t xml:space="preserve">Grid</w:t>
+            </w:r>
+          </w:p>
+        </w:tc>
+        <w:tc>
+          <w:tcPr>
+            <w:tcW w:type="dxa" w:w="1200"/>
+            <w:tcMar>
+              <w:top w:type="dxa" w:w="80"/>
+              <w:left w:type="dxa" w:w="100"/>
+              <w:bottom w:type="dxa" w:w="80"/>
+              <w:right w:type="dxa" w:w="100"/>
+            </w:tcMar>
+            <w:vAlign w:val="center"/>
+          </w:tcPr>
+          <w:p>
+            <w:r>
+              <w:rPr>
+                <w:b w:val="false"/>
+                <w:bCs w:val="false"/>
+                <w:sz w:val="20"/>
+                <w:szCs w:val="20"/>
+              </w:rPr>
+              <w:t xml:space="preserve">0.684</w:t>
+            </w:r>
+          </w:p>
+        </w:tc>
+        <w:tc>
+          <w:tcPr>
+            <w:tcW w:type="dxa" w:w="1200"/>
+            <w:tcMar>
+              <w:top w:type="dxa" w:w="80"/>
+              <w:left w:type="dxa" w:w="100"/>
+              <w:bottom w:type="dxa" w:w="80"/>
+              <w:right w:type="dxa" w:w="100"/>
+            </w:tcMar>
+            <w:vAlign w:val="center"/>
+          </w:tcPr>
+          <w:p>
+            <w:r>
+              <w:rPr>
+                <w:b w:val="false"/>
+                <w:bCs w:val="false"/>
+                <w:sz w:val="20"/>
+                <w:szCs w:val="20"/>
+              </w:rPr>
+              <w:t xml:space="preserve">0.255</w:t>
+            </w:r>
+          </w:p>
+        </w:tc>
+        <w:tc>
+          <w:tcPr>
+            <w:tcW w:type="dxa" w:w="1000"/>
+            <w:tcMar>
+              <w:top w:type="dxa" w:w="80"/>
+              <w:left w:type="dxa" w:w="100"/>
+              <w:bottom w:type="dxa" w:w="80"/>
+              <w:right w:type="dxa" w:w="100"/>
+            </w:tcMar>
+            <w:vAlign w:val="center"/>
+          </w:tcPr>
+          <w:p>
+            <w:r>
+              <w:rPr>
+                <w:b w:val="false"/>
+                <w:bCs w:val="false"/>
+                <w:sz w:val="20"/>
+                <w:szCs w:val="20"/>
+              </w:rPr>
+              <w:t xml:space="preserve">0.648</w:t>
+            </w:r>
+          </w:p>
+        </w:tc>
+        <w:tc>
+          <w:tcPr>
+            <w:tcW w:type="dxa" w:w="1000"/>
+            <w:tcMar>
+              <w:top w:type="dxa" w:w="80"/>
+              <w:left w:type="dxa" w:w="100"/>
+              <w:bottom w:type="dxa" w:w="80"/>
+              <w:right w:type="dxa" w:w="100"/>
+            </w:tcMar>
+            <w:vAlign w:val="center"/>
+          </w:tcPr>
+          <w:p>
+            <w:r>
+              <w:rPr>
+                <w:b w:val="false"/>
+                <w:bCs w:val="false"/>
+                <w:sz w:val="20"/>
+                <w:szCs w:val="20"/>
+              </w:rPr>
+              <w:t xml:space="preserve">0.366</w:t>
+            </w:r>
+          </w:p>
+        </w:tc>
+        <w:tc>
+          <w:tcPr>
+            <w:tcW w:type="dxa" w:w="1000"/>
+            <w:tcMar>
+              <w:top w:type="dxa" w:w="80"/>
+              <w:left w:type="dxa" w:w="100"/>
+              <w:bottom w:type="dxa" w:w="80"/>
+              <w:right w:type="dxa" w:w="100"/>
+            </w:tcMar>
+            <w:vAlign w:val="center"/>
+          </w:tcPr>
+          <w:p>
+            <w:r>
+              <w:rPr>
+                <w:b w:val="false"/>
+                <w:bCs w:val="false"/>
+                <w:sz w:val="20"/>
+                <w:szCs w:val="20"/>
+              </w:rPr>
+              <w:t xml:space="preserve">0.722</w:t>
+            </w:r>
+          </w:p>
+        </w:tc>
+      </w:tr>
+      <w:tr>
+        <w:tc>
+          <w:tcPr>
+            <w:tcW w:type="dxa" w:w="2400"/>
+            <w:tcMar>
+              <w:top w:type="dxa" w:w="80"/>
+              <w:left w:type="dxa" w:w="100"/>
+              <w:bottom w:type="dxa" w:w="80"/>
+              <w:right w:type="dxa" w:w="100"/>
+            </w:tcMar>
+            <w:vAlign w:val="center"/>
+          </w:tcPr>
+          <w:p>
+            <w:r>
+              <w:rPr>
+                <w:b w:val="false"/>
+                <w:bCs w:val="false"/>
+                <w:sz w:val="20"/>
+                <w:szCs w:val="20"/>
+              </w:rPr>
+              <w:t xml:space="preserve">Decision Tree</w:t>
+            </w:r>
+          </w:p>
+        </w:tc>
+        <w:tc>
+          <w:tcPr>
+            <w:tcW w:type="dxa" w:w="1400"/>
+            <w:tcMar>
+              <w:top w:type="dxa" w:w="80"/>
+              <w:left w:type="dxa" w:w="100"/>
+              <w:bottom w:type="dxa" w:w="80"/>
+              <w:right w:type="dxa" w:w="100"/>
+            </w:tcMar>
+            <w:vAlign w:val="center"/>
+          </w:tcPr>
+          <w:p>
+            <w:r>
+              <w:rPr>
+                <w:b w:val="false"/>
+                <w:bCs w:val="false"/>
+                <w:sz w:val="20"/>
+                <w:szCs w:val="20"/>
+              </w:rPr>
+              <w:t xml:space="preserve">Randomized</w:t>
+            </w:r>
+          </w:p>
+        </w:tc>
+        <w:tc>
+          <w:tcPr>
+            <w:tcW w:type="dxa" w:w="1200"/>
+            <w:tcMar>
+              <w:top w:type="dxa" w:w="80"/>
+              <w:left w:type="dxa" w:w="100"/>
+              <w:bottom w:type="dxa" w:w="80"/>
+              <w:right w:type="dxa" w:w="100"/>
+            </w:tcMar>
+            <w:vAlign w:val="center"/>
+          </w:tcPr>
+          <w:p>
+            <w:r>
+              <w:rPr>
+                <w:b w:val="false"/>
+                <w:bCs w:val="false"/>
+                <w:sz w:val="20"/>
+                <w:szCs w:val="20"/>
+              </w:rPr>
+              <w:t xml:space="preserve">0.725</w:t>
+            </w:r>
+          </w:p>
+        </w:tc>
+        <w:tc>
+          <w:tcPr>
+            <w:tcW w:type="dxa" w:w="1200"/>
+            <w:tcMar>
+              <w:top w:type="dxa" w:w="80"/>
+              <w:left w:type="dxa" w:w="100"/>
+              <w:bottom w:type="dxa" w:w="80"/>
+              <w:right w:type="dxa" w:w="100"/>
+            </w:tcMar>
+            <w:vAlign w:val="center"/>
+          </w:tcPr>
+          <w:p>
+            <w:r>
+              <w:rPr>
+                <w:b w:val="false"/>
+                <w:bCs w:val="false"/>
+                <w:sz w:val="20"/>
+                <w:szCs w:val="20"/>
+              </w:rPr>
+              <w:t xml:space="preserve">0.285</w:t>
+            </w:r>
+          </w:p>
+        </w:tc>
+        <w:tc>
+          <w:tcPr>
+            <w:tcW w:type="dxa" w:w="1000"/>
+            <w:tcMar>
+              <w:top w:type="dxa" w:w="80"/>
+              <w:left w:type="dxa" w:w="100"/>
+              <w:bottom w:type="dxa" w:w="80"/>
+              <w:right w:type="dxa" w:w="100"/>
+            </w:tcMar>
+            <w:vAlign w:val="center"/>
+          </w:tcPr>
+          <w:p>
+            <w:r>
+              <w:rPr>
+                <w:b w:val="false"/>
+                <w:bCs w:val="false"/>
+                <w:sz w:val="20"/>
+                <w:szCs w:val="20"/>
+              </w:rPr>
+              <w:t xml:space="preserve">0.635</w:t>
+            </w:r>
+          </w:p>
+        </w:tc>
+        <w:tc>
+          <w:tcPr>
+            <w:tcW w:type="dxa" w:w="1000"/>
+            <w:tcMar>
+              <w:top w:type="dxa" w:w="80"/>
+              <w:left w:type="dxa" w:w="100"/>
+              <w:bottom w:type="dxa" w:w="80"/>
+              <w:right w:type="dxa" w:w="100"/>
+            </w:tcMar>
+            <w:vAlign w:val="center"/>
+          </w:tcPr>
+          <w:p>
+            <w:r>
+              <w:rPr>
+                <w:b w:val="false"/>
+                <w:bCs w:val="false"/>
+                <w:sz w:val="20"/>
+                <w:szCs w:val="20"/>
+              </w:rPr>
+              <w:t xml:space="preserve">0.394</w:t>
+            </w:r>
+          </w:p>
+        </w:tc>
+        <w:tc>
+          <w:tcPr>
+            <w:tcW w:type="dxa" w:w="1000"/>
+            <w:tcMar>
+              <w:top w:type="dxa" w:w="80"/>
+              <w:left w:type="dxa" w:w="100"/>
+              <w:bottom w:type="dxa" w:w="80"/>
+              <w:right w:type="dxa" w:w="100"/>
+            </w:tcMar>
+            <w:vAlign w:val="center"/>
+          </w:tcPr>
+          <w:p>
+            <w:r>
+              <w:rPr>
+                <w:b w:val="false"/>
+                <w:bCs w:val="false"/>
+                <w:sz w:val="20"/>
+                <w:szCs w:val="20"/>
+              </w:rPr>
+              <w:t xml:space="preserve">0.744</w:t>
+            </w:r>
+          </w:p>
+        </w:tc>
+      </w:tr>
+      <w:tr>
+        <w:tc>
+          <w:tcPr>
+            <w:tcW w:type="dxa" w:w="2400"/>
+            <w:tcMar>
+              <w:top w:type="dxa" w:w="80"/>
+              <w:left w:type="dxa" w:w="100"/>
+              <w:bottom w:type="dxa" w:w="80"/>
+              <w:right w:type="dxa" w:w="100"/>
+            </w:tcMar>
+            <w:vAlign w:val="center"/>
+          </w:tcPr>
+          <w:p>
+            <w:r>
+              <w:rPr>
+                <w:b w:val="false"/>
+                <w:bCs w:val="false"/>
+                <w:sz w:val="20"/>
+                <w:szCs w:val="20"/>
+              </w:rPr>
+              <w:t xml:space="preserve">Random Forest</w:t>
+            </w:r>
+          </w:p>
+        </w:tc>
+        <w:tc>
+          <w:tcPr>
+            <w:tcW w:type="dxa" w:w="1400"/>
+            <w:tcMar>
+              <w:top w:type="dxa" w:w="80"/>
+              <w:left w:type="dxa" w:w="100"/>
+              <w:bottom w:type="dxa" w:w="80"/>
+              <w:right w:type="dxa" w:w="100"/>
+            </w:tcMar>
+            <w:vAlign w:val="center"/>
+          </w:tcPr>
+          <w:p>
+            <w:r>
+              <w:rPr>
+                <w:b w:val="false"/>
+                <w:bCs w:val="false"/>
+                <w:sz w:val="20"/>
+                <w:szCs w:val="20"/>
+              </w:rPr>
+              <w:t xml:space="preserve">Randomized</w:t>
+            </w:r>
+          </w:p>
+        </w:tc>
+        <w:tc>
+          <w:tcPr>
+            <w:tcW w:type="dxa" w:w="1200"/>
+            <w:tcMar>
+              <w:top w:type="dxa" w:w="80"/>
+              <w:left w:type="dxa" w:w="100"/>
+              <w:bottom w:type="dxa" w:w="80"/>
+              <w:right w:type="dxa" w:w="100"/>
+            </w:tcMar>
+            <w:vAlign w:val="center"/>
+          </w:tcPr>
+          <w:p>
+            <w:r>
+              <w:rPr>
+                <w:b w:val="false"/>
+                <w:bCs w:val="false"/>
+                <w:sz w:val="20"/>
+                <w:szCs w:val="20"/>
+              </w:rPr>
+              <w:t xml:space="preserve">0.756</w:t>
+            </w:r>
+          </w:p>
+        </w:tc>
+        <w:tc>
+          <w:tcPr>
+            <w:tcW w:type="dxa" w:w="1200"/>
+            <w:tcMar>
+              <w:top w:type="dxa" w:w="80"/>
+              <w:left w:type="dxa" w:w="100"/>
+              <w:bottom w:type="dxa" w:w="80"/>
+              <w:right w:type="dxa" w:w="100"/>
+            </w:tcMar>
+            <w:vAlign w:val="center"/>
+          </w:tcPr>
+          <w:p>
+            <w:r>
+              <w:rPr>
+                <w:b w:val="false"/>
+                <w:bCs w:val="false"/>
+                <w:sz w:val="20"/>
+                <w:szCs w:val="20"/>
+              </w:rPr>
+              <w:t xml:space="preserve">0.297</w:t>
+            </w:r>
+          </w:p>
+        </w:tc>
+        <w:tc>
+          <w:tcPr>
+            <w:tcW w:type="dxa" w:w="1000"/>
+            <w:tcMar>
+              <w:top w:type="dxa" w:w="80"/>
+              <w:left w:type="dxa" w:w="100"/>
+              <w:bottom w:type="dxa" w:w="80"/>
+              <w:right w:type="dxa" w:w="100"/>
+            </w:tcMar>
+            <w:vAlign w:val="center"/>
+          </w:tcPr>
+          <w:p>
+            <w:r>
+              <w:rPr>
+                <w:b w:val="false"/>
+                <w:bCs w:val="false"/>
+                <w:sz w:val="20"/>
+                <w:szCs w:val="20"/>
+              </w:rPr>
+              <w:t xml:space="preserve">0.536</w:t>
+            </w:r>
+          </w:p>
+        </w:tc>
+        <w:tc>
+          <w:tcPr>
+            <w:tcW w:type="dxa" w:w="1000"/>
+            <w:tcMar>
+              <w:top w:type="dxa" w:w="80"/>
+              <w:left w:type="dxa" w:w="100"/>
+              <w:bottom w:type="dxa" w:w="80"/>
+              <w:right w:type="dxa" w:w="100"/>
+            </w:tcMar>
+            <w:vAlign w:val="center"/>
+          </w:tcPr>
+          <w:p>
+            <w:r>
+              <w:rPr>
+                <w:b w:val="false"/>
+                <w:bCs w:val="false"/>
+                <w:sz w:val="20"/>
+                <w:szCs w:val="20"/>
+              </w:rPr>
+              <w:t xml:space="preserve">0.382</w:t>
+            </w:r>
+          </w:p>
+        </w:tc>
+        <w:tc>
+          <w:tcPr>
+            <w:tcW w:type="dxa" w:w="1000"/>
+            <w:tcMar>
+              <w:top w:type="dxa" w:w="80"/>
+              <w:left w:type="dxa" w:w="100"/>
+              <w:bottom w:type="dxa" w:w="80"/>
+              <w:right w:type="dxa" w:w="100"/>
+            </w:tcMar>
+            <w:vAlign w:val="center"/>
+          </w:tcPr>
+          <w:p>
+            <w:r>
+              <w:rPr>
+                <w:b w:val="false"/>
+                <w:bCs w:val="false"/>
+                <w:sz w:val="20"/>
+                <w:szCs w:val="20"/>
+              </w:rPr>
+              <w:t xml:space="preserve">0.731</w:t>
+            </w:r>
+          </w:p>
+        </w:tc>
+      </w:tr>
+      <w:tr>
+        <w:tc>
+          <w:tcPr>
+            <w:tcW w:type="dxa" w:w="2400"/>
+            <w:tcMar>
+              <w:top w:type="dxa" w:w="80"/>
+              <w:left w:type="dxa" w:w="100"/>
+              <w:bottom w:type="dxa" w:w="80"/>
+              <w:right w:type="dxa" w:w="100"/>
+            </w:tcMar>
+            <w:vAlign w:val="center"/>
+          </w:tcPr>
+          <w:p>
+            <w:r>
+              <w:rPr>
+                <w:b w:val="false"/>
+                <w:bCs w:val="false"/>
+                <w:sz w:val="20"/>
+                <w:szCs w:val="20"/>
+              </w:rPr>
+              <w:t xml:space="preserve">Neural Network (MLP)</w:t>
+            </w:r>
+          </w:p>
+        </w:tc>
+        <w:tc>
+          <w:tcPr>
+            <w:tcW w:type="dxa" w:w="1400"/>
+            <w:tcMar>
+              <w:top w:type="dxa" w:w="80"/>
+              <w:left w:type="dxa" w:w="100"/>
+              <w:bottom w:type="dxa" w:w="80"/>
+              <w:right w:type="dxa" w:w="100"/>
+            </w:tcMar>
+            <w:vAlign w:val="center"/>
+          </w:tcPr>
+          <w:p>
+            <w:r>
+              <w:rPr>
+                <w:b w:val="false"/>
+                <w:bCs w:val="false"/>
+                <w:sz w:val="20"/>
+                <w:szCs w:val="20"/>
+              </w:rPr>
+              <w:t xml:space="preserve">Grid</w:t>
+            </w:r>
+          </w:p>
+        </w:tc>
+        <w:tc>
+          <w:tcPr>
+            <w:tcW w:type="dxa" w:w="1200"/>
+            <w:tcMar>
+              <w:top w:type="dxa" w:w="80"/>
+              <w:left w:type="dxa" w:w="100"/>
+              <w:bottom w:type="dxa" w:w="80"/>
+              <w:right w:type="dxa" w:w="100"/>
+            </w:tcMar>
+            <w:vAlign w:val="center"/>
+          </w:tcPr>
+          <w:p>
+            <w:r>
+              <w:rPr>
+                <w:b w:val="false"/>
+                <w:bCs w:val="false"/>
+                <w:sz w:val="20"/>
+                <w:szCs w:val="20"/>
+              </w:rPr>
+              <w:t xml:space="preserve">0.863</w:t>
+            </w:r>
+          </w:p>
+        </w:tc>
+        <w:tc>
+          <w:tcPr>
+            <w:tcW w:type="dxa" w:w="1200"/>
+            <w:tcMar>
+              <w:top w:type="dxa" w:w="80"/>
+              <w:left w:type="dxa" w:w="100"/>
+              <w:bottom w:type="dxa" w:w="80"/>
+              <w:right w:type="dxa" w:w="100"/>
+            </w:tcMar>
+            <w:vAlign w:val="center"/>
+          </w:tcPr>
+          <w:p>
+            <w:r>
+              <w:rPr>
+                <w:b w:val="false"/>
+                <w:bCs w:val="false"/>
+                <w:sz w:val="20"/>
+                <w:szCs w:val="20"/>
+              </w:rPr>
+              <w:t xml:space="preserve">0.522</w:t>
+            </w:r>
+          </w:p>
+        </w:tc>
+        <w:tc>
+          <w:tcPr>
+            <w:tcW w:type="dxa" w:w="1000"/>
+            <w:tcMar>
+              <w:top w:type="dxa" w:w="80"/>
+              <w:left w:type="dxa" w:w="100"/>
+              <w:bottom w:type="dxa" w:w="80"/>
+              <w:right w:type="dxa" w:w="100"/>
+            </w:tcMar>
+            <w:vAlign w:val="center"/>
+          </w:tcPr>
+          <w:p>
+            <w:r>
+              <w:rPr>
+                <w:b w:val="false"/>
+                <w:bCs w:val="false"/>
+                <w:sz w:val="20"/>
+                <w:szCs w:val="20"/>
+              </w:rPr>
+              <w:t xml:space="preserve">0.330</w:t>
+            </w:r>
+          </w:p>
+        </w:tc>
+        <w:tc>
+          <w:tcPr>
+            <w:tcW w:type="dxa" w:w="1000"/>
+            <w:tcMar>
+              <w:top w:type="dxa" w:w="80"/>
+              <w:left w:type="dxa" w:w="100"/>
+              <w:bottom w:type="dxa" w:w="80"/>
+              <w:right w:type="dxa" w:w="100"/>
+            </w:tcMar>
+            <w:vAlign w:val="center"/>
+          </w:tcPr>
+          <w:p>
+            <w:r>
+              <w:rPr>
+                <w:b w:val="false"/>
+                <w:bCs w:val="false"/>
+                <w:sz w:val="20"/>
+                <w:szCs w:val="20"/>
+              </w:rPr>
+              <w:t xml:space="preserve">0.404</w:t>
+            </w:r>
+          </w:p>
+        </w:tc>
+        <w:tc>
+          <w:tcPr>
+            <w:tcW w:type="dxa" w:w="1000"/>
+            <w:tcMar>
+              <w:top w:type="dxa" w:w="80"/>
+              <w:left w:type="dxa" w:w="100"/>
+              <w:bottom w:type="dxa" w:w="80"/>
+              <w:right w:type="dxa" w:w="100"/>
+            </w:tcMar>
+            <w:vAlign w:val="center"/>
+          </w:tcPr>
+          <w:p>
+            <w:r>
+              <w:rPr>
+                <w:b w:val="false"/>
+                <w:bCs w:val="false"/>
+                <w:sz w:val="20"/>
+                <w:szCs w:val="20"/>
+              </w:rPr>
+              <w:t xml:space="preserve">0.792</w:t>
+            </w:r>
+          </w:p>
+        </w:tc>
+      </w:tr>
+    </w:tbl>
+    <w:p>
+      <w:pPr>
+        <w:spacing w:after="200"/>
+      </w:pPr>
+    </w:p>
+    <w:p>
+      <w:pPr>
+        <w:jc w:val="center"/>
+      </w:pPr>
+      <w:r>
+        <w:drawing>
+          <wp:inline distT="0" distB="0" distL="0" distR="0">
+            <wp:extent cx="4572000" cy="3914775"/>
+            <wp:effectExtent t="0" r="0" b="0" l="0"/>
+            <wp:docPr id="1" name="" descr="" title=""/>
+            <wp:cNvGraphicFramePr>
+              <a:graphicFrameLocks xmlns:a="http://schemas.openxmlformats.org/drawingml/2006/main" noChangeAspect="1"/>
+            </wp:cNvGraphicFramePr>
+            <a:graphic xmlns:a="http://schemas.openxmlformats.org/drawingml/2006/main">
+              <a:graphicData uri="http://schemas.openxmlformats.org/drawingml/2006/picture">
+                <pic:pic xmlns:pic="http://schemas.openxmlformats.org/drawingml/2006/picture">
+                  <pic:nvPicPr>
+                    <pic:cNvPr id="0" name="" descr=""/>
+                    <pic:cNvPicPr>
+                      <a:picLocks noChangeAspect="1" noChangeArrowheads="1"/>
+                    </pic:cNvPicPr>
+                  </pic:nvPicPr>
+                  <pic:blipFill>
+                    <a:blip r:embed="rId14" cstate="none"/>
+                    <a:srcRect/>
+                    <a:stretch>
+                      <a:fillRect/>
+                    </a:stretch>
+                  </pic:blipFill>
+                  <pic:spPr bwMode="auto">
+                    <a:xfrm>
+                      <a:off x="0" y="0"/>
+                      <a:ext cx="4572000" cy="3914775"/>
+                    </a:xfrm>
+                    <a:prstGeom prst="rect">
+                      <a:avLst/>
+                    </a:prstGeom>
+                  </pic:spPr>
+                </pic:pic>
+              </a:graphicData>
+            </a:graphic>
+          </wp:inline>
+        </w:drawing>
+      </w:r>
+    </w:p>
+    <w:p>
+      <w:pPr>
+        <w:spacing w:after="200"/>
+      </w:pPr>
+    </w:p>
+    <w:p>
+      <w:pPr>
+        <w:spacing w:after="150"/>
+      </w:pPr>
+      <w:r>
+        <w:t xml:space="preserve">Confusion matrices (test set, 3,792 records: 3,258 non-fatal, 534 fatal):</w:t>
+      </w:r>
+    </w:p>
+    <w:tbl>
+      <w:tblPr>
+        <w:tblW w:type="dxa" w:w="9200"/>
+        <w:tblBorders>
+          <w:top w:val="single" w:color="auto" w:sz="4"/>
+          <w:left w:val="single" w:color="auto" w:sz="4"/>
+          <w:bottom w:val="single" w:color="auto" w:sz="4"/>
+          <w:right w:val="single" w:color="auto" w:sz="4"/>
+          <w:insideH w:val="single" w:color="auto" w:sz="4"/>
+          <w:insideV w:val="single" w:color="auto" w:sz="4"/>
+        </w:tblBorders>
+      </w:tblPr>
+      <w:tblGrid>
+        <w:gridCol w:w="2600"/>
+        <w:gridCol w:w="1650"/>
+        <w:gridCol w:w="1650"/>
+        <w:gridCol w:w="1650"/>
+        <w:gridCol w:w="1650"/>
+      </w:tblGrid>
+      <w:tr>
+        <w:tc>
+          <w:tcPr>
+            <w:tcW w:type="dxa" w:w="2600"/>
+            <w:shd w:fill="D9D9D9" w:val="clear"/>
+            <w:tcMar>
+              <w:top w:type="dxa" w:w="80"/>
+              <w:left w:type="dxa" w:w="100"/>
+              <w:bottom w:type="dxa" w:w="80"/>
+              <w:right w:type="dxa" w:w="100"/>
+            </w:tcMar>
+            <w:vAlign w:val="center"/>
+          </w:tcPr>
+          <w:p>
+            <w:r>
+              <w:rPr>
+                <w:b/>
+                <w:bCs/>
+                <w:sz w:val="20"/>
+                <w:szCs w:val="20"/>
+              </w:rPr>
+              <w:t xml:space="preserve">Model</w:t>
+            </w:r>
+          </w:p>
+        </w:tc>
+        <w:tc>
+          <w:tcPr>
+            <w:tcW w:type="dxa" w:w="1650"/>
+            <w:shd w:fill="D9D9D9" w:val="clear"/>
+            <w:tcMar>
+              <w:top w:type="dxa" w:w="80"/>
+              <w:left w:type="dxa" w:w="100"/>
+              <w:bottom w:type="dxa" w:w="80"/>
+              <w:right w:type="dxa" w:w="100"/>
+            </w:tcMar>
+            <w:vAlign w:val="center"/>
+          </w:tcPr>
+          <w:p>
+            <w:r>
+              <w:rPr>
+                <w:b/>
+                <w:bCs/>
+                <w:sz w:val="20"/>
+                <w:szCs w:val="20"/>
+              </w:rPr>
+              <w:t xml:space="preserve">True Negative</w:t>
+            </w:r>
+          </w:p>
+        </w:tc>
+        <w:tc>
+          <w:tcPr>
+            <w:tcW w:type="dxa" w:w="1650"/>
+            <w:shd w:fill="D9D9D9" w:val="clear"/>
+            <w:tcMar>
+              <w:top w:type="dxa" w:w="80"/>
+              <w:left w:type="dxa" w:w="100"/>
+              <w:bottom w:type="dxa" w:w="80"/>
+              <w:right w:type="dxa" w:w="100"/>
+            </w:tcMar>
+            <w:vAlign w:val="center"/>
+          </w:tcPr>
+          <w:p>
+            <w:r>
+              <w:rPr>
+                <w:b/>
+                <w:bCs/>
+                <w:sz w:val="20"/>
+                <w:szCs w:val="20"/>
+              </w:rPr>
+              <w:t xml:space="preserve">False Positive</w:t>
+            </w:r>
+          </w:p>
+        </w:tc>
+        <w:tc>
+          <w:tcPr>
+            <w:tcW w:type="dxa" w:w="1650"/>
+            <w:shd w:fill="D9D9D9" w:val="clear"/>
+            <w:tcMar>
+              <w:top w:type="dxa" w:w="80"/>
+              <w:left w:type="dxa" w:w="100"/>
+              <w:bottom w:type="dxa" w:w="80"/>
+              <w:right w:type="dxa" w:w="100"/>
+            </w:tcMar>
+            <w:vAlign w:val="center"/>
+          </w:tcPr>
+          <w:p>
+            <w:r>
+              <w:rPr>
+                <w:b/>
+                <w:bCs/>
+                <w:sz w:val="20"/>
+                <w:szCs w:val="20"/>
+              </w:rPr>
+              <w:t xml:space="preserve">False Negative</w:t>
+            </w:r>
+          </w:p>
+        </w:tc>
+        <w:tc>
+          <w:tcPr>
+            <w:tcW w:type="dxa" w:w="1650"/>
+            <w:shd w:fill="D9D9D9" w:val="clear"/>
+            <w:tcMar>
+              <w:top w:type="dxa" w:w="80"/>
+              <w:left w:type="dxa" w:w="100"/>
+              <w:bottom w:type="dxa" w:w="80"/>
+              <w:right w:type="dxa" w:w="100"/>
+            </w:tcMar>
+            <w:vAlign w:val="center"/>
+          </w:tcPr>
+          <w:p>
+            <w:r>
+              <w:rPr>
+                <w:b/>
+                <w:bCs/>
+                <w:sz w:val="20"/>
+                <w:szCs w:val="20"/>
+              </w:rPr>
+              <w:t xml:space="preserve">True Positive</w:t>
+            </w:r>
+          </w:p>
+        </w:tc>
+      </w:tr>
+      <w:tr>
+        <w:tc>
+          <w:tcPr>
+            <w:tcW w:type="dxa" w:w="2600"/>
+            <w:tcMar>
+              <w:top w:type="dxa" w:w="80"/>
+              <w:left w:type="dxa" w:w="100"/>
+              <w:bottom w:type="dxa" w:w="80"/>
+              <w:right w:type="dxa" w:w="100"/>
+            </w:tcMar>
+            <w:vAlign w:val="center"/>
+          </w:tcPr>
+          <w:p>
+            <w:r>
+              <w:rPr>
+                <w:b w:val="false"/>
+                <w:bCs w:val="false"/>
+                <w:sz w:val="20"/>
+                <w:szCs w:val="20"/>
+              </w:rPr>
+              <w:t xml:space="preserve">Logistic Regression</w:t>
+            </w:r>
+          </w:p>
+        </w:tc>
+        <w:tc>
+          <w:tcPr>
+            <w:tcW w:type="dxa" w:w="1650"/>
+            <w:tcMar>
+              <w:top w:type="dxa" w:w="80"/>
+              <w:left w:type="dxa" w:w="100"/>
+              <w:bottom w:type="dxa" w:w="80"/>
+              <w:right w:type="dxa" w:w="100"/>
+            </w:tcMar>
+            <w:vAlign w:val="center"/>
+          </w:tcPr>
+          <w:p>
+            <w:r>
+              <w:rPr>
+                <w:b w:val="false"/>
+                <w:bCs w:val="false"/>
+                <w:sz w:val="20"/>
+                <w:szCs w:val="20"/>
+              </w:rPr>
+              <w:t xml:space="preserve">2250</w:t>
+            </w:r>
+          </w:p>
+        </w:tc>
+        <w:tc>
+          <w:tcPr>
+            <w:tcW w:type="dxa" w:w="1650"/>
+            <w:tcMar>
+              <w:top w:type="dxa" w:w="80"/>
+              <w:left w:type="dxa" w:w="100"/>
+              <w:bottom w:type="dxa" w:w="80"/>
+              <w:right w:type="dxa" w:w="100"/>
+            </w:tcMar>
+            <w:vAlign w:val="center"/>
+          </w:tcPr>
+          <w:p>
+            <w:r>
+              <w:rPr>
+                <w:b w:val="false"/>
+                <w:bCs w:val="false"/>
+                <w:sz w:val="20"/>
+                <w:szCs w:val="20"/>
+              </w:rPr>
+              <w:t xml:space="preserve">1008</w:t>
+            </w:r>
+          </w:p>
+        </w:tc>
+        <w:tc>
+          <w:tcPr>
+            <w:tcW w:type="dxa" w:w="1650"/>
+            <w:tcMar>
+              <w:top w:type="dxa" w:w="80"/>
+              <w:left w:type="dxa" w:w="100"/>
+              <w:bottom w:type="dxa" w:w="80"/>
+              <w:right w:type="dxa" w:w="100"/>
+            </w:tcMar>
+            <w:vAlign w:val="center"/>
+          </w:tcPr>
+          <w:p>
+            <w:r>
+              <w:rPr>
+                <w:b w:val="false"/>
+                <w:bCs w:val="false"/>
+                <w:sz w:val="20"/>
+                <w:szCs w:val="20"/>
+              </w:rPr>
+              <w:t xml:space="preserve">188</w:t>
+            </w:r>
+          </w:p>
+        </w:tc>
+        <w:tc>
+          <w:tcPr>
+            <w:tcW w:type="dxa" w:w="1650"/>
+            <w:tcMar>
+              <w:top w:type="dxa" w:w="80"/>
+              <w:left w:type="dxa" w:w="100"/>
+              <w:bottom w:type="dxa" w:w="80"/>
+              <w:right w:type="dxa" w:w="100"/>
+            </w:tcMar>
+            <w:vAlign w:val="center"/>
+          </w:tcPr>
+          <w:p>
+            <w:r>
+              <w:rPr>
+                <w:b w:val="false"/>
+                <w:bCs w:val="false"/>
+                <w:sz w:val="20"/>
+                <w:szCs w:val="20"/>
+              </w:rPr>
+              <w:t xml:space="preserve">346</w:t>
+            </w:r>
+          </w:p>
+        </w:tc>
+      </w:tr>
+      <w:tr>
+        <w:tc>
+          <w:tcPr>
+            <w:tcW w:type="dxa" w:w="2600"/>
+            <w:tcMar>
+              <w:top w:type="dxa" w:w="80"/>
+              <w:left w:type="dxa" w:w="100"/>
+              <w:bottom w:type="dxa" w:w="80"/>
+              <w:right w:type="dxa" w:w="100"/>
+            </w:tcMar>
+            <w:vAlign w:val="center"/>
+          </w:tcPr>
+          <w:p>
+            <w:r>
+              <w:rPr>
+                <w:b w:val="false"/>
+                <w:bCs w:val="false"/>
+                <w:sz w:val="20"/>
+                <w:szCs w:val="20"/>
+              </w:rPr>
+              <w:t xml:space="preserve">Linear SVM</w:t>
+            </w:r>
+          </w:p>
+        </w:tc>
+        <w:tc>
+          <w:tcPr>
+            <w:tcW w:type="dxa" w:w="1650"/>
+            <w:tcMar>
+              <w:top w:type="dxa" w:w="80"/>
+              <w:left w:type="dxa" w:w="100"/>
+              <w:bottom w:type="dxa" w:w="80"/>
+              <w:right w:type="dxa" w:w="100"/>
+            </w:tcMar>
+            <w:vAlign w:val="center"/>
+          </w:tcPr>
+          <w:p>
+            <w:r>
+              <w:rPr>
+                <w:b w:val="false"/>
+                <w:bCs w:val="false"/>
+                <w:sz w:val="20"/>
+                <w:szCs w:val="20"/>
+              </w:rPr>
+              <w:t xml:space="preserve">2249</w:t>
+            </w:r>
+          </w:p>
+        </w:tc>
+        <w:tc>
+          <w:tcPr>
+            <w:tcW w:type="dxa" w:w="1650"/>
+            <w:tcMar>
+              <w:top w:type="dxa" w:w="80"/>
+              <w:left w:type="dxa" w:w="100"/>
+              <w:bottom w:type="dxa" w:w="80"/>
+              <w:right w:type="dxa" w:w="100"/>
+            </w:tcMar>
+            <w:vAlign w:val="center"/>
+          </w:tcPr>
+          <w:p>
+            <w:r>
+              <w:rPr>
+                <w:b w:val="false"/>
+                <w:bCs w:val="false"/>
+                <w:sz w:val="20"/>
+                <w:szCs w:val="20"/>
+              </w:rPr>
+              <w:t xml:space="preserve">1009</w:t>
+            </w:r>
+          </w:p>
+        </w:tc>
+        <w:tc>
+          <w:tcPr>
+            <w:tcW w:type="dxa" w:w="1650"/>
+            <w:tcMar>
+              <w:top w:type="dxa" w:w="80"/>
+              <w:left w:type="dxa" w:w="100"/>
+              <w:bottom w:type="dxa" w:w="80"/>
+              <w:right w:type="dxa" w:w="100"/>
+            </w:tcMar>
+            <w:vAlign w:val="center"/>
+          </w:tcPr>
+          <w:p>
+            <w:r>
+              <w:rPr>
+                <w:b w:val="false"/>
+                <w:bCs w:val="false"/>
+                <w:sz w:val="20"/>
+                <w:szCs w:val="20"/>
+              </w:rPr>
+              <w:t xml:space="preserve">188</w:t>
+            </w:r>
+          </w:p>
+        </w:tc>
+        <w:tc>
+          <w:tcPr>
+            <w:tcW w:type="dxa" w:w="1650"/>
+            <w:tcMar>
+              <w:top w:type="dxa" w:w="80"/>
+              <w:left w:type="dxa" w:w="100"/>
+              <w:bottom w:type="dxa" w:w="80"/>
+              <w:right w:type="dxa" w:w="100"/>
+            </w:tcMar>
+            <w:vAlign w:val="center"/>
+          </w:tcPr>
+          <w:p>
+            <w:r>
+              <w:rPr>
+                <w:b w:val="false"/>
+                <w:bCs w:val="false"/>
+                <w:sz w:val="20"/>
+                <w:szCs w:val="20"/>
+              </w:rPr>
+              <w:t xml:space="preserve">346</w:t>
+            </w:r>
+          </w:p>
+        </w:tc>
+      </w:tr>
+      <w:tr>
+        <w:tc>
+          <w:tcPr>
+            <w:tcW w:type="dxa" w:w="2600"/>
+            <w:tcMar>
+              <w:top w:type="dxa" w:w="80"/>
+              <w:left w:type="dxa" w:w="100"/>
+              <w:bottom w:type="dxa" w:w="80"/>
+              <w:right w:type="dxa" w:w="100"/>
+            </w:tcMar>
+            <w:vAlign w:val="center"/>
+          </w:tcPr>
+          <w:p>
+            <w:r>
+              <w:rPr>
+                <w:b w:val="false"/>
+                <w:bCs w:val="false"/>
+                <w:sz w:val="20"/>
+                <w:szCs w:val="20"/>
+              </w:rPr>
+              <w:t xml:space="preserve">Decision Tree</w:t>
+            </w:r>
+          </w:p>
+        </w:tc>
+        <w:tc>
+          <w:tcPr>
+            <w:tcW w:type="dxa" w:w="1650"/>
+            <w:tcMar>
+              <w:top w:type="dxa" w:w="80"/>
+              <w:left w:type="dxa" w:w="100"/>
+              <w:bottom w:type="dxa" w:w="80"/>
+              <w:right w:type="dxa" w:w="100"/>
+            </w:tcMar>
+            <w:vAlign w:val="center"/>
+          </w:tcPr>
+          <w:p>
+            <w:r>
+              <w:rPr>
+                <w:b w:val="false"/>
+                <w:bCs w:val="false"/>
+                <w:sz w:val="20"/>
+                <w:szCs w:val="20"/>
+              </w:rPr>
+              <w:t xml:space="preserve">2409</w:t>
+            </w:r>
+          </w:p>
+        </w:tc>
+        <w:tc>
+          <w:tcPr>
+            <w:tcW w:type="dxa" w:w="1650"/>
+            <w:tcMar>
+              <w:top w:type="dxa" w:w="80"/>
+              <w:left w:type="dxa" w:w="100"/>
+              <w:bottom w:type="dxa" w:w="80"/>
+              <w:right w:type="dxa" w:w="100"/>
+            </w:tcMar>
+            <w:vAlign w:val="center"/>
+          </w:tcPr>
+          <w:p>
+            <w:r>
+              <w:rPr>
+                <w:b w:val="false"/>
+                <w:bCs w:val="false"/>
+                <w:sz w:val="20"/>
+                <w:szCs w:val="20"/>
+              </w:rPr>
+              <w:t xml:space="preserve">849</w:t>
+            </w:r>
+          </w:p>
+        </w:tc>
+        <w:tc>
+          <w:tcPr>
+            <w:tcW w:type="dxa" w:w="1650"/>
+            <w:tcMar>
+              <w:top w:type="dxa" w:w="80"/>
+              <w:left w:type="dxa" w:w="100"/>
+              <w:bottom w:type="dxa" w:w="80"/>
+              <w:right w:type="dxa" w:w="100"/>
+            </w:tcMar>
+            <w:vAlign w:val="center"/>
+          </w:tcPr>
+          <w:p>
+            <w:r>
+              <w:rPr>
+                <w:b w:val="false"/>
+                <w:bCs w:val="false"/>
+                <w:sz w:val="20"/>
+                <w:szCs w:val="20"/>
+              </w:rPr>
+              <w:t xml:space="preserve">195</w:t>
+            </w:r>
+          </w:p>
+        </w:tc>
+        <w:tc>
+          <w:tcPr>
+            <w:tcW w:type="dxa" w:w="1650"/>
+            <w:tcMar>
+              <w:top w:type="dxa" w:w="80"/>
+              <w:left w:type="dxa" w:w="100"/>
+              <w:bottom w:type="dxa" w:w="80"/>
+              <w:right w:type="dxa" w:w="100"/>
+            </w:tcMar>
+            <w:vAlign w:val="center"/>
+          </w:tcPr>
+          <w:p>
+            <w:r>
+              <w:rPr>
+                <w:b w:val="false"/>
+                <w:bCs w:val="false"/>
+                <w:sz w:val="20"/>
+                <w:szCs w:val="20"/>
+              </w:rPr>
+              <w:t xml:space="preserve">339</w:t>
+            </w:r>
+          </w:p>
+        </w:tc>
+      </w:tr>
+      <w:tr>
+        <w:tc>
+          <w:tcPr>
+            <w:tcW w:type="dxa" w:w="2600"/>
+            <w:tcMar>
+              <w:top w:type="dxa" w:w="80"/>
+              <w:left w:type="dxa" w:w="100"/>
+              <w:bottom w:type="dxa" w:w="80"/>
+              <w:right w:type="dxa" w:w="100"/>
+            </w:tcMar>
+            <w:vAlign w:val="center"/>
+          </w:tcPr>
+          <w:p>
+            <w:r>
+              <w:rPr>
+                <w:b w:val="false"/>
+                <w:bCs w:val="false"/>
+                <w:sz w:val="20"/>
+                <w:szCs w:val="20"/>
+              </w:rPr>
+              <w:t xml:space="preserve">Random Forest</w:t>
+            </w:r>
+          </w:p>
+        </w:tc>
+        <w:tc>
+          <w:tcPr>
+            <w:tcW w:type="dxa" w:w="1650"/>
+            <w:tcMar>
+              <w:top w:type="dxa" w:w="80"/>
+              <w:left w:type="dxa" w:w="100"/>
+              <w:bottom w:type="dxa" w:w="80"/>
+              <w:right w:type="dxa" w:w="100"/>
+            </w:tcMar>
+            <w:vAlign w:val="center"/>
+          </w:tcPr>
+          <w:p>
+            <w:r>
+              <w:rPr>
+                <w:b w:val="false"/>
+                <w:bCs w:val="false"/>
+                <w:sz w:val="20"/>
+                <w:szCs w:val="20"/>
+              </w:rPr>
+              <w:t xml:space="preserve">2581</w:t>
+            </w:r>
+          </w:p>
+        </w:tc>
+        <w:tc>
+          <w:tcPr>
+            <w:tcW w:type="dxa" w:w="1650"/>
+            <w:tcMar>
+              <w:top w:type="dxa" w:w="80"/>
+              <w:left w:type="dxa" w:w="100"/>
+              <w:bottom w:type="dxa" w:w="80"/>
+              <w:right w:type="dxa" w:w="100"/>
+            </w:tcMar>
+            <w:vAlign w:val="center"/>
+          </w:tcPr>
+          <w:p>
+            <w:r>
+              <w:rPr>
+                <w:b w:val="false"/>
+                <w:bCs w:val="false"/>
+                <w:sz w:val="20"/>
+                <w:szCs w:val="20"/>
+              </w:rPr>
+              <w:t xml:space="preserve">677</w:t>
+            </w:r>
+          </w:p>
+        </w:tc>
+        <w:tc>
+          <w:tcPr>
+            <w:tcW w:type="dxa" w:w="1650"/>
+            <w:tcMar>
+              <w:top w:type="dxa" w:w="80"/>
+              <w:left w:type="dxa" w:w="100"/>
+              <w:bottom w:type="dxa" w:w="80"/>
+              <w:right w:type="dxa" w:w="100"/>
+            </w:tcMar>
+            <w:vAlign w:val="center"/>
+          </w:tcPr>
+          <w:p>
+            <w:r>
+              <w:rPr>
+                <w:b w:val="false"/>
+                <w:bCs w:val="false"/>
+                <w:sz w:val="20"/>
+                <w:szCs w:val="20"/>
+              </w:rPr>
+              <w:t xml:space="preserve">248</w:t>
+            </w:r>
+          </w:p>
+        </w:tc>
+        <w:tc>
+          <w:tcPr>
+            <w:tcW w:type="dxa" w:w="1650"/>
+            <w:tcMar>
+              <w:top w:type="dxa" w:w="80"/>
+              <w:left w:type="dxa" w:w="100"/>
+              <w:bottom w:type="dxa" w:w="80"/>
+              <w:right w:type="dxa" w:w="100"/>
+            </w:tcMar>
+            <w:vAlign w:val="center"/>
+          </w:tcPr>
+          <w:p>
+            <w:r>
+              <w:rPr>
+                <w:b w:val="false"/>
+                <w:bCs w:val="false"/>
+                <w:sz w:val="20"/>
+                <w:szCs w:val="20"/>
+              </w:rPr>
+              <w:t xml:space="preserve">286</w:t>
+            </w:r>
+          </w:p>
+        </w:tc>
+      </w:tr>
+      <w:tr>
+        <w:tc>
+          <w:tcPr>
+            <w:tcW w:type="dxa" w:w="2600"/>
+            <w:tcMar>
+              <w:top w:type="dxa" w:w="80"/>
+              <w:left w:type="dxa" w:w="100"/>
+              <w:bottom w:type="dxa" w:w="80"/>
+              <w:right w:type="dxa" w:w="100"/>
+            </w:tcMar>
+            <w:vAlign w:val="center"/>
+          </w:tcPr>
+          <w:p>
+            <w:r>
+              <w:rPr>
+                <w:b w:val="false"/>
+                <w:bCs w:val="false"/>
+                <w:sz w:val="20"/>
+                <w:szCs w:val="20"/>
+              </w:rPr>
+              <w:t xml:space="preserve">Neural Network (MLP)</w:t>
+            </w:r>
+          </w:p>
+        </w:tc>
+        <w:tc>
+          <w:tcPr>
+            <w:tcW w:type="dxa" w:w="1650"/>
+            <w:tcMar>
+              <w:top w:type="dxa" w:w="80"/>
+              <w:left w:type="dxa" w:w="100"/>
+              <w:bottom w:type="dxa" w:w="80"/>
+              <w:right w:type="dxa" w:w="100"/>
+            </w:tcMar>
+            <w:vAlign w:val="center"/>
+          </w:tcPr>
+          <w:p>
+            <w:r>
+              <w:rPr>
+                <w:b w:val="false"/>
+                <w:bCs w:val="false"/>
+                <w:sz w:val="20"/>
+                <w:szCs w:val="20"/>
+              </w:rPr>
+              <w:t xml:space="preserve">3097</w:t>
+            </w:r>
+          </w:p>
+        </w:tc>
+        <w:tc>
+          <w:tcPr>
+            <w:tcW w:type="dxa" w:w="1650"/>
+            <w:tcMar>
+              <w:top w:type="dxa" w:w="80"/>
+              <w:left w:type="dxa" w:w="100"/>
+              <w:bottom w:type="dxa" w:w="80"/>
+              <w:right w:type="dxa" w:w="100"/>
+            </w:tcMar>
+            <w:vAlign w:val="center"/>
+          </w:tcPr>
+          <w:p>
+            <w:r>
+              <w:rPr>
+                <w:b w:val="false"/>
+                <w:bCs w:val="false"/>
+                <w:sz w:val="20"/>
+                <w:szCs w:val="20"/>
+              </w:rPr>
+              <w:t xml:space="preserve">161</w:t>
+            </w:r>
+          </w:p>
+        </w:tc>
+        <w:tc>
+          <w:tcPr>
+            <w:tcW w:type="dxa" w:w="1650"/>
+            <w:tcMar>
+              <w:top w:type="dxa" w:w="80"/>
+              <w:left w:type="dxa" w:w="100"/>
+              <w:bottom w:type="dxa" w:w="80"/>
+              <w:right w:type="dxa" w:w="100"/>
+            </w:tcMar>
+            <w:vAlign w:val="center"/>
+          </w:tcPr>
+          <w:p>
+            <w:r>
+              <w:rPr>
+                <w:b w:val="false"/>
+                <w:bCs w:val="false"/>
+                <w:sz w:val="20"/>
+                <w:szCs w:val="20"/>
+              </w:rPr>
+              <w:t xml:space="preserve">358</w:t>
+            </w:r>
+          </w:p>
+        </w:tc>
+        <w:tc>
+          <w:tcPr>
+            <w:tcW w:type="dxa" w:w="1650"/>
+            <w:tcMar>
+              <w:top w:type="dxa" w:w="80"/>
+              <w:left w:type="dxa" w:w="100"/>
+              <w:bottom w:type="dxa" w:w="80"/>
+              <w:right w:type="dxa" w:w="100"/>
+            </w:tcMar>
+            <w:vAlign w:val="center"/>
+          </w:tcPr>
+          <w:p>
+            <w:r>
+              <w:rPr>
+                <w:b w:val="false"/>
+                <w:bCs w:val="false"/>
+                <w:sz w:val="20"/>
+                <w:szCs w:val="20"/>
+              </w:rPr>
+              <w:t xml:space="preserve">176</w:t>
+            </w:r>
+          </w:p>
+        </w:tc>
+      </w:tr>
+    </w:tbl>
+    <w:p>
+      <w:pPr>
+        <w:spacing w:after="200"/>
+      </w:pPr>
+    </w:p>
+    <w:p>
+      <w:pPr>
+        <w:spacing w:after="150"/>
+      </w:pPr>
+      <w:r>
+        <w:t xml:space="preserve">Model selection: Logistic Regression (C=0.1, class_weight='balanced', found via grid search) was selected for deployment. It achieved the best fatal-class recall (0.648) of all five, tied with Linear SVM but slightly ahead on F1 (0.367 vs. 0.366). Recall was prioritized over accuracy, precision, F1, or even AUC because the cost of missing a real fatal case is judged higher than the cost of a false alarm for this application. Random Forest and the Neural Network both scored higher on accuracy, precision, and AUC, but their recall (0.536 and 0.330 respectively) was too low for this priority.</w:t>
+      </w:r>
+    </w:p>
+    <w:p>
+      <w:pPr>
+        <w:spacing w:after="150"/>
+      </w:pPr>
+      <w:r>
+        <w:t xml:space="preserve">Worth noting: the Neural Network had the best AUC (0.792) despite the worst recall at the default classification threshold — a sign it ranks cases well overall but would need a different decision threshold to be competitive on recall specifically. This is flagged as a possible further improvement rather than pursued, given the time available (see Limitations and Further Work).</w:t>
+      </w:r>
+    </w:p>
+    <w:p>
+      <w:pPr>
+        <w:pStyle w:val="Heading1"/>
+        <w:spacing w:after="200" w:before="400"/>
+      </w:pPr>
+      <w:r>
+        <w:t xml:space="preserve">Deployment</w:t>
+      </w:r>
+    </w:p>
+    <w:p>
+      <w:pPr>
+        <w:spacing w:after="150"/>
+      </w:pPr>
+      <w:r>
+        <w:t xml:space="preserve">The selected model — preprocessing and the Logistic Regression classifier combined into a single scikit-learn Pipeline, so preprocessing is refit correctly and consistently — is serialized with Python's pickle module to final_model.pkl. A Flask API (part2/app.py) loads this file and exposes three routes: GET / (a simple Jinja-templated HTML form for manually entering collision details and viewing a prediction), POST /predict (accepts a JSON body of collision attributes and returns a JSON prediction), and GET /health (a status check confirming the model loaded correctly).</w:t>
+      </w:r>
+    </w:p>
+    <w:p>
+      <w:pPr>
+        <w:spacing w:after="150"/>
+      </w:pPr>
+      <w:r>
+        <w:t xml:space="preserve">Fields not provided in a request are treated as missing and handled by the same imputer used during training, so a caller does not need to supply every feature. Verified with real test calls: an input describing a dark, 5 AM collision with speeding predicts FATAL at 73.3% probability; an input with no details predicts NOT FATAL at 49.8% probability — close to 50/50 rather than the true 14% base rate, an expected effect of class_weight='balanced' recalibrating predicted probabilities rather than a defect.</w:t>
+      </w:r>
+    </w:p>
+    <w:p>
+      <w:pPr>
+        <w:pStyle w:val="Heading1"/>
+        <w:spacing w:after="200" w:before="400"/>
+      </w:pPr>
+      <w:r>
+        <w:t xml:space="preserve">Limitations and Further Work</w:t>
       </w:r>
     </w:p>
     <w:p>
@@ -4165,7 +5975,7 @@
         <w:spacing w:after="80"/>
       </w:pPr>
       <w:r>
-        <w:t xml:space="preserve">Revisit per-collision aggregation (vs. current per-person rows) as a potential modelling improvement</w:t>
+        <w:t xml:space="preserve">Per-collision aggregation (vs. current per-person rows) was discussed but not implemented; the same collision can currently appear split across both the train and test sets via different people involved, which may make test performance slightly optimistic.</w:t>
       </w:r>
     </w:p>
     <w:p>
@@ -4178,7 +5988,7 @@
         <w:spacing w:after="80"/>
       </w:pPr>
       <w:r>
-        <w:t xml:space="preserve">Build and tune logistic regression, decision tree, SVM, random forest, and neural network models</w:t>
+        <w:t xml:space="preserve">Preprocessing was not refit inside every cross-validation fold during most of tuning; the final deployed pipeline corrects this specifically for the selected model.</w:t>
       </w:r>
     </w:p>
     <w:p>
@@ -4191,7 +6001,7 @@
         <w:spacing w:after="80"/>
       </w:pPr>
       <w:r>
-        <w:t xml:space="preserve">Score and compare models (accuracy, precision, recall, F1, ROC curves); select best model</w:t>
+        <w:t xml:space="preserve">The Neural Network's strong AUC (0.792) versus weak default-threshold recall (0.330) suggests decision-threshold tuning could improve it further; not pursued given the time available.</w:t>
       </w:r>
     </w:p>
     <w:p>
@@ -4204,7 +6014,7 @@
         <w:spacing w:after="80"/>
       </w:pPr>
       <w:r>
-        <w:t xml:space="preserve">Deploy the selected model as a Flask API; build a front end / test client</w:t>
+        <w:t xml:space="preserve">Ibrahim's assigned Part 2 tuning work was not submitted; covered directly by another team member so the deliverable is complete (see Data Modelling, Assumptions and constraints, and the project README for full attribution).</w:t>
       </w:r>
     </w:p>
     <w:p>
@@ -4217,7 +6027,7 @@
         <w:spacing w:after="80"/>
       </w:pPr>
       <w:r>
-        <w:t xml:space="preserve">Write full report (executive summary, solution overview) and prepare presentation</w:t>
+        <w:t xml:space="preserve">The INJURY data leak was caught during Part 2, not Part 1 — a reminder to check for suspiciously strong single-feature relationships with the target earlier in future projects.</w:t>
       </w:r>
     </w:p>
     <w:sectPr>

</xml_diff>

<commit_message>
Update final report and add KSI project presentation
</commit_message>
<xml_diff>
--- a/pipeline/report/Part1_Report.docx
+++ b/pipeline/report/Part1_Report.docx
@@ -126,6 +126,7 @@
         <w:spacing w:after="150"/>
       </w:pPr>
       <w:r>
+        <w:rPr/>
         <w:t>This project develops a machine-learning classifier that predicts whether a Toronto traffic collision record is associated with a fatal outcome. The goal is to identify combinations of collision conditions that are linked to fatality risk and produce a model that can flag higher-risk cases.</w:t>
       </w:r>
     </w:p>
@@ -134,10 +135,8 @@
         <w:spacing w:after="150"/>
       </w:pPr>
       <w:r>
-        <w:rPr>
-          <w:b w:val="0"/>
-        </w:rPr>
-        <w:t>The project uses the Toronto Police Service Killed or Seriously Injured (KSI) dataset, covering 2006–2023. The dataset contains 18,957 person-level records, with 18,956 usable labelled records after removing the single blank ACCLASS value. Fatal records make up 14.09% of the labelled data, so the prediction problem is moderately imbalanced.</w:t>
+        <w:rPr/>
+        <w:t>The project uses the Toronto Police Service Killed or Seriously Injured (KSI) dataset, covering 2006-2023. The dataset contains 18,957 person-level records, with 18,956 usable labelled records after removing the single blank ACCLASS value. Fatal records make up 14.09% of the labelled data, making recall on the fatal class more informative than raw accuracy.</w:t>
       </w:r>
     </w:p>
     <w:p>
@@ -145,10 +144,8 @@
         <w:spacing w:after="150"/>
       </w:pPr>
       <w:r>
-        <w:rPr>
-          <w:b w:val="0"/>
-        </w:rPr>
-        <w:t>The data was cleaned and prepared through a scikit-learn preprocessing pipeline. Identifier, redundant, high-cardinality and leakage-prone fields were removed; TIME was converted into an HOUR feature; categorical features were imputed and one-hot encoded; and numerical features were median-imputed and standardized. The data was then split 80/20 using stratification, producing 15,164 training rows and 3,792 test rows with 373 encoded features.</w:t>
+        <w:rPr/>
+        <w:t>The data was cleaned and prepared through a scikit-learn preprocessing pipeline. Identifier, redundant, high-cardinality, structurally missing, and leakage-prone fields were removed; TIME was converted into an HOUR feature; categorical features were imputed and one-hot encoded; and numerical features were median-imputed and standardized. During Part 2, the INJURY field was also removed after it was found to almost directly reveal the ACCLASS target, preventing target leakage in the final modelling pipeline.</w:t>
       </w:r>
     </w:p>
     <w:p>
@@ -156,10 +153,8 @@
         <w:spacing w:after="150"/>
       </w:pPr>
       <w:r>
-        <w:rPr>
-          <w:b w:val="0"/>
-        </w:rPr>
-        <w:t>Five classification models are compared: Logistic Regression, Decision Tree, Random Forest, Linear SVM, and a Multi-Layer Perceptron Neural Network. Performance is evaluated using accuracy, precision, recall, F1-score and confusion matrices, but fatal-class recall is treated as the primary metric because a model can achieve high accuracy by mainly predicting the majority non-fatal class while still missing many true fatalities.</w:t>
+        <w:rPr/>
+        <w:t>Five classification models were compared: Logistic Regression, Decision Tree, Random Forest, Linear SVM, and a Multi-Layer Perceptron Neural Network. All five were fine-tuned using Grid Search and Randomized Search with five-fold cross-validation, with fatal-class recall used as the primary selection metric.</w:t>
       </w:r>
     </w:p>
     <w:p>
@@ -167,10 +162,8 @@
         <w:spacing w:after="150"/>
       </w:pPr>
       <w:r>
-        <w:rPr>
-          <w:b w:val="0"/>
-        </w:rPr>
-        <w:t>In the current untuned baseline comparison, Linear SVM achieved the highest fatal-class recall at 0.670, followed by Logistic Regression at 0.663 and Decision Tree at 0.661. Decision Tree provided the strongest overall balance in the baseline run with an F1-score of 0.642, while Random Forest produced the highest accuracy at 0.922 but only 0.448 recall. These results reinforce why recall is more meaningful than raw accuracy for this project.</w:t>
+        <w:rPr/>
+        <w:t>After tuning on the corrected pipeline, Logistic Regression was selected as the final model. With C = 0.1 and class_weight = 'balanced', it achieved a fatal-class recall of 0.648, meaning it identified approximately 64.8% of the actual fatal cases in the held-out test data. Linear SVM reached the same recall, but Logistic Regression had a slightly higher F1-score and was therefore selected as the winner.</w:t>
       </w:r>
     </w:p>
     <w:p>
@@ -178,22 +171,8 @@
         <w:spacing w:after="150"/>
       </w:pPr>
       <w:r>
-        <w:rPr>
-          <w:b/>
-          <w:color w:val="C00000"/>
-        </w:rPr>
-        <w:t>[FINAL TEAM INPUT REQUIRED: After hyperparameter tuning is complete, replace this line with the winning model, its final fatal-class recall, and the final tuned settings.]</w:t>
-      </w:r>
-    </w:p>
-    <w:p>
-      <w:pPr>
-        <w:spacing w:after="150"/>
-      </w:pPr>
-      <w:r>
-        <w:rPr>
-          <w:b w:val="0"/>
-        </w:rPr>
-        <w:t>The selected model is intended to be saved and served through a lightweight Flask API so that collision details such as location, time, road and environmental conditions, and involvement factors can be submitted for a fatality-risk prediction. Identifying higher-risk collision conditions could help inform where traffic-safety attention and resources may be most valuable.</w:t>
+        <w:rPr/>
+        <w:t>The winning preprocessing pipeline and Logistic Regression classifier were saved together as final_model.pkl and deployed through a lightweight Flask application. The API can accept collision details and return a fatality-risk prediction. Identifying conditions associated with a higher likelihood of fatal outcomes could help inform where traffic-safety attention, preventive measures, and resources may be most valuable.</w:t>
       </w:r>
     </w:p>
     <w:p>
@@ -210,7 +189,8 @@
         <w:spacing w:after="150"/>
       </w:pPr>
       <w:r>
-        <w:t>The solution follows an end-to-end workflow: prepare the raw KSI data, transform it into model-ready features, compare several classification algorithms, tune the strongest candidates, select the final model using fatal-class recall as the priority, and expose the selected predictor through an API.</w:t>
+        <w:rPr/>
+        <w:t>The solution follows an end-to-end machine-learning workflow: prepare the raw KSI data, transform it into model-ready features, compare five classification algorithms, fine-tune all five models, select the strongest model using fatal-class recall as the priority, and expose the selected predictor through a Flask API.</w:t>
       </w:r>
     </w:p>
     <w:p>
@@ -229,10 +209,8 @@
         <w:spacing w:after="150"/>
       </w:pPr>
       <w:r>
-        <w:rPr>
-          <w:b w:val="0"/>
-        </w:rPr>
-        <w:t>ACCLASS is converted into a binary target where Fatal = 1 and all other usable labelled outcomes = 0. Rows with a blank target are removed. INDEX, ACCNUM, OBJECTID, OFFSET and redundant location identifiers are excluded because they do not provide useful predictive information. FATAL_NO is removed because it directly leaks the fatal outcome. STREET1 and STREET2 are dropped because of their very high cardinality, while DATE and TIME are replaced by the engineered HOUR feature.</w:t>
+        <w:rPr/>
+        <w:t>ACCLASS is converted into a binary target where Fatal = 1 and all other usable labelled outcomes = 0, and rows with a blank target are removed. Identifier and redundant fields such as INDEX, ACCNUM, OBJECTID, OFFSET and duplicate location fields are excluded. FATAL_NO is removed because it directly reveals a fatal outcome, while STREET1 and STREET2 are dropped because of their very high cardinality. DATE and TIME are replaced by the engineered HOUR feature. In Part 2, INJURY was also removed after validation showed that INJURY = 'Fatal' matched ACCLASS = 'Fatal' in 974 of 975 relevant records, making it an unsafe leakage feature for prediction.</w:t>
       </w:r>
     </w:p>
     <w:p>
@@ -240,10 +218,8 @@
         <w:spacing w:after="150"/>
       </w:pPr>
       <w:r>
-        <w:rPr>
-          <w:b w:val="0"/>
-        </w:rPr>
-        <w:t>Categorical variables are processed with most-frequent imputation and one-hot encoding. Numerical variables (LATITUDE, LONGITUDE and HOUR) are median-imputed and standardized. Structurally missing pedestrian- and cyclist-specific fields are excluded rather than imputed across records where they do not apply. The final train/test split is 80/20 and stratified to preserve the 14.09% fatal-class proportion.</w:t>
+        <w:rPr/>
+        <w:t>Categorical variables are processed with most-frequent imputation and one-hot encoding. Numerical variables, including LATITUDE, LONGITUDE and HOUR, are median-imputed and standardized. Structurally missing pedestrian- and cyclist-specific fields are excluded rather than imputed across records where they do not apply. The data is split 80/20 using stratification so the approximately 14.09% fatal-class proportion is preserved.</w:t>
       </w:r>
     </w:p>
     <w:p>
@@ -262,10 +238,8 @@
         <w:spacing w:after="150"/>
       </w:pPr>
       <w:r>
-        <w:rPr>
-          <w:b w:val="0"/>
-        </w:rPr>
-        <w:t>The project compares Logistic Regression, Decision Tree, Random Forest, Linear SVM and a Neural Network (MLP). Using models from different families provides a more reliable comparison because each can capture different types of relationships in the collision data. For models that support it, class_weight='balanced' is used to reduce the tendency to ignore the minority fatal class.</w:t>
+        <w:rPr/>
+        <w:t>The project compares Logistic Regression, Decision Tree, Random Forest, Linear SVM and a Neural Network (MLP). Using models from different families provides a broader comparison because the algorithms learn different types of relationships in the collision data. Where supported, class_weight = 'balanced' is used to reduce the tendency to ignore the minority fatal class.</w:t>
       </w:r>
     </w:p>
     <w:p>
@@ -273,10 +247,8 @@
         <w:spacing w:after="150"/>
       </w:pPr>
       <w:r>
-        <w:rPr>
-          <w:b w:val="0"/>
-        </w:rPr>
-        <w:t>All five baseline models are evaluated on the same held-out test set using accuracy, precision, recall, F1-score and confusion matrices. Recall is prioritized because it answers the main safety question: of all records that were actually fatal, how many did the model correctly identify? With roughly 86% of records in the non-fatal class, accuracy alone can be misleading.</w:t>
+        <w:rPr/>
+        <w:t>The corrected models are evaluated using accuracy, precision, recall, F1-score and ROC-AUC. Recall is prioritized because it answers the main safety question: of all records that were actually fatal, how many did the model correctly identify? Since roughly 86% of records are non-fatal, accuracy alone can look strong even when a model misses many true fatal cases. Each model is fine-tuned using both Grid Search and Randomized Search with five-fold cross-validation scored primarily on recall.</w:t>
       </w:r>
     </w:p>
     <w:p>
@@ -287,7 +259,7 @@
         <w:rPr>
           <w:b/>
         </w:rPr>
-        <w:t>Current Baseline Results</w:t>
+        <w:t>Final Tuned Results</w:t>
       </w:r>
     </w:p>
     <w:p>
@@ -295,10 +267,8 @@
         <w:spacing w:after="150"/>
       </w:pPr>
       <w:r>
-        <w:rPr>
-          <w:b w:val="0"/>
-        </w:rPr>
-        <w:t>The untuned baseline results show Linear SVM with the highest recall (0.670), Logistic Regression at 0.663, Decision Tree at 0.661, Neural Network at 0.459, and Random Forest at 0.448. Decision Tree currently offers the strongest balance between recall and precision, with an F1-score of 0.642. Random Forest has very high precision (0.996) and accuracy (0.922), but its low recall means it misses more than half of the true fatal cases.</w:t>
+        <w:rPr/>
+        <w:t>The final tuned recalls on the corrected pipeline were 0.648 for Logistic Regression, 0.648 for Linear SVM, 0.635 for Decision Tree, 0.536 for Random Forest, and 0.330 for the Neural Network. Although the Neural Network achieved the highest ROC-AUC at 0.792, its recall at the default threshold was substantially lower than the leading models, so it was not selected for deployment.</w:t>
       </w:r>
     </w:p>
     <w:p>
@@ -317,22 +287,8 @@
         <w:spacing w:after="150"/>
       </w:pPr>
       <w:r>
-        <w:rPr>
-          <w:b w:val="0"/>
-        </w:rPr>
-        <w:t>Hyperparameter tuning is being divided across the team using GridSearchCV scored on recall. Aboud's tuning script covers Logistic Regression and Linear SVM, Ibrahim's covers Decision Tree and Random Forest, and the Neural Network tuning and final model selection are handled separately. The final winner will be chosen primarily by fatal-class recall, with precision, F1-score and the confusion matrix used to check the overall trade-off.</w:t>
-      </w:r>
-    </w:p>
-    <w:p>
-      <w:pPr>
-        <w:spacing w:after="150"/>
-      </w:pPr>
-      <w:r>
-        <w:rPr>
-          <w:b/>
-          <w:color w:val="C00000"/>
-        </w:rPr>
-        <w:t>[FINAL TEAM INPUT REQUIRED: Add the final winning model, tuned fatal-class recall, best hyperparameters, and one sentence explaining why it was selected over the other models.]</w:t>
+        <w:rPr/>
+        <w:t>Logistic Regression was selected as the final model using C = 0.1 and class_weight = 'balanced'. It achieved accuracy = 0.685, precision = 0.256, recall = 0.648, F1-score = 0.367 and ROC-AUC = 0.722. Linear SVM achieved the same recall, but Logistic Regression had a slightly higher F1-score. Because missing a truly fatal case was considered more costly for this project than generating an additional false alarm, recall was given priority over accuracy, precision, or ROC-AUC when choosing the final model.</w:t>
       </w:r>
     </w:p>
     <w:p>
@@ -351,10 +307,8 @@
         <w:spacing w:after="150"/>
       </w:pPr>
       <w:r>
-        <w:rPr>
-          <w:b w:val="0"/>
-        </w:rPr>
-        <w:t>After the final model is selected, the trained model and preprocessing workflow are intended to be serialized and loaded by a small Flask API. Incoming collision attributes will pass through the same preprocessing logic used during training before the model returns a fatality-risk prediction. Keeping preprocessing and prediction together ensures that live inputs are transformed consistently with the training data.</w:t>
+        <w:rPr/>
+        <w:t>The final preprocessing pipeline and selected Logistic Regression classifier are saved together in part2/final_model.pkl. The deployed Flask application in part2/app.py loads this file and provides both a simple web form and a POST /predict API endpoint. Incoming collision attributes pass through the same preprocessing logic used during training before the model generates a fatal or non-fatal prediction.</w:t>
       </w:r>
     </w:p>
     <w:p>
@@ -362,11 +316,8 @@
         <w:spacing w:after="150"/>
       </w:pPr>
       <w:r>
-        <w:rPr>
-          <w:b/>
-          <w:color w:val="C00000"/>
-        </w:rPr>
-        <w:t>[FINAL TEAM INPUT REQUIRED: Once deployment is complete, add the confirmed saved-model filename, Flask endpoint, expected request fields, and one verified example response. Keep the current future-tense wording until this is confirmed.]</w:t>
+        <w:rPr/>
+        <w:t>The API accepts available collision-related fields such as district, lighting conditions, hour and speeding status, while omitted fields are handled by the same imputation pipeline used during training. End-to-end testing with a high-risk example (Scarborough, dark conditions, 5 AM and speeding) returned a FATAL prediction with an estimated probability of 73.3%, confirming that the saved model and Flask prediction workflow operate together successfully.</w:t>
       </w:r>
     </w:p>
     <w:p>

</xml_diff>